<commit_message>
Complete full teacher manual audit
</commit_message>
<xml_diff>
--- a/output/doc/c0-n-star-instructor-controlled-reveal-sheets.docx
+++ b/output/doc/c0-n-star-instructor-controlled-reveal-sheets.docx
@@ -889,7 +889,7 @@
         </m:r>
       </m:oMath>
       <w:r>
-        <w:t xml:space="preserve">, and</w:t>
+        <w:t xml:space="preserve">,</w:t>
       </w:r>
       <w:r>
         <w:t xml:space="preserve"> </w:t>
@@ -948,6 +948,74 @@
         </m:r>
         <m:r>
           <m:t>.16</m:t>
+        </m:r>
+        <m:r>
+          <m:rPr>
+            <m:sty m:val="p"/>
+          </m:rPr>
+          <m:t>]</m:t>
+        </m:r>
+      </m:oMath>
+      <w:r>
+        <w:t xml:space="preserve">, and</w:t>
+      </w:r>
+      <w:r>
+        <w:t xml:space="preserve"> </w:t>
+      </w:r>
+      <m:oMath>
+        <m:r>
+          <m:rPr>
+            <m:sty m:val="p"/>
+          </m:rPr>
+          <m:t>Δ</m:t>
+        </m:r>
+        <m:sSub>
+          <m:e>
+            <m:r>
+              <m:t>N</m:t>
+            </m:r>
+          </m:e>
+          <m:sub>
+            <m:r>
+              <m:t>3</m:t>
+            </m:r>
+          </m:sub>
+        </m:sSub>
+        <m:r>
+          <m:rPr>
+            <m:sty m:val="p"/>
+          </m:rPr>
+          <m:t>=</m:t>
+        </m:r>
+        <m:r>
+          <m:rPr>
+            <m:sty m:val="p"/>
+          </m:rPr>
+          <m:t>[</m:t>
+        </m:r>
+        <m:r>
+          <m:rPr>
+            <m:sty m:val="p"/>
+          </m:rPr>
+          <m:t>−</m:t>
+        </m:r>
+        <m:r>
+          <m:t>.43</m:t>
+        </m:r>
+        <m:r>
+          <m:rPr>
+            <m:sty m:val="p"/>
+          </m:rPr>
+          <m:t>,</m:t>
+        </m:r>
+        <m:r>
+          <m:rPr>
+            <m:sty m:val="p"/>
+          </m:rPr>
+          <m:t>−</m:t>
+        </m:r>
+        <m:r>
+          <m:t>.31</m:t>
         </m:r>
         <m:r>
           <m:rPr>
@@ -1399,7 +1467,7 @@
         </m:r>
       </m:oMath>
       <w:r>
-        <w:t xml:space="preserve">, and</w:t>
+        <w:t xml:space="preserve">,</w:t>
       </w:r>
       <w:r>
         <w:t xml:space="preserve"> </w:t>
@@ -1452,6 +1520,74 @@
         </m:r>
         <m:r>
           <m:t>.02</m:t>
+        </m:r>
+        <m:r>
+          <m:rPr>
+            <m:sty m:val="p"/>
+          </m:rPr>
+          <m:t>]</m:t>
+        </m:r>
+      </m:oMath>
+      <w:r>
+        <w:t xml:space="preserve">, and</w:t>
+      </w:r>
+      <w:r>
+        <w:t xml:space="preserve"> </w:t>
+      </w:r>
+      <m:oMath>
+        <m:r>
+          <m:rPr>
+            <m:sty m:val="p"/>
+          </m:rPr>
+          <m:t>Δ</m:t>
+        </m:r>
+        <m:sSub>
+          <m:e>
+            <m:r>
+              <m:t>N</m:t>
+            </m:r>
+          </m:e>
+          <m:sub>
+            <m:r>
+              <m:t>3</m:t>
+            </m:r>
+          </m:sub>
+        </m:sSub>
+        <m:r>
+          <m:rPr>
+            <m:sty m:val="p"/>
+          </m:rPr>
+          <m:t>=</m:t>
+        </m:r>
+        <m:r>
+          <m:rPr>
+            <m:sty m:val="p"/>
+          </m:rPr>
+          <m:t>[</m:t>
+        </m:r>
+        <m:r>
+          <m:rPr>
+            <m:sty m:val="p"/>
+          </m:rPr>
+          <m:t>−</m:t>
+        </m:r>
+        <m:r>
+          <m:t>.35</m:t>
+        </m:r>
+        <m:r>
+          <m:rPr>
+            <m:sty m:val="p"/>
+          </m:rPr>
+          <m:t>,</m:t>
+        </m:r>
+        <m:r>
+          <m:rPr>
+            <m:sty m:val="p"/>
+          </m:rPr>
+          <m:t>−</m:t>
+        </m:r>
+        <m:r>
+          <m:t>.23</m:t>
         </m:r>
         <m:r>
           <m:rPr>
@@ -1922,7 +2058,7 @@
         </m:r>
       </m:oMath>
       <w:r>
-        <w:t xml:space="preserve">, and</w:t>
+        <w:t xml:space="preserve">,</w:t>
       </w:r>
       <w:r>
         <w:t xml:space="preserve"> </w:t>
@@ -1975,6 +2111,74 @@
         </m:r>
         <m:r>
           <m:t>.02</m:t>
+        </m:r>
+        <m:r>
+          <m:rPr>
+            <m:sty m:val="p"/>
+          </m:rPr>
+          <m:t>]</m:t>
+        </m:r>
+      </m:oMath>
+      <w:r>
+        <w:t xml:space="preserve">, and</w:t>
+      </w:r>
+      <w:r>
+        <w:t xml:space="preserve"> </w:t>
+      </w:r>
+      <m:oMath>
+        <m:r>
+          <m:rPr>
+            <m:sty m:val="p"/>
+          </m:rPr>
+          <m:t>Δ</m:t>
+        </m:r>
+        <m:sSub>
+          <m:e>
+            <m:r>
+              <m:t>N</m:t>
+            </m:r>
+          </m:e>
+          <m:sub>
+            <m:r>
+              <m:t>3</m:t>
+            </m:r>
+          </m:sub>
+        </m:sSub>
+        <m:r>
+          <m:rPr>
+            <m:sty m:val="p"/>
+          </m:rPr>
+          <m:t>=</m:t>
+        </m:r>
+        <m:r>
+          <m:rPr>
+            <m:sty m:val="p"/>
+          </m:rPr>
+          <m:t>[</m:t>
+        </m:r>
+        <m:r>
+          <m:rPr>
+            <m:sty m:val="p"/>
+          </m:rPr>
+          <m:t>−</m:t>
+        </m:r>
+        <m:r>
+          <m:t>.35</m:t>
+        </m:r>
+        <m:r>
+          <m:rPr>
+            <m:sty m:val="p"/>
+          </m:rPr>
+          <m:t>,</m:t>
+        </m:r>
+        <m:r>
+          <m:rPr>
+            <m:sty m:val="p"/>
+          </m:rPr>
+          <m:t>−</m:t>
+        </m:r>
+        <m:r>
+          <m:t>.23</m:t>
         </m:r>
         <m:r>
           <m:rPr>
@@ -2426,7 +2630,7 @@
         </m:r>
       </m:oMath>
       <w:r>
-        <w:t xml:space="preserve">, and</w:t>
+        <w:t xml:space="preserve">,</w:t>
       </w:r>
       <w:r>
         <w:t xml:space="preserve"> </w:t>
@@ -2479,6 +2683,68 @@
         </m:r>
         <m:r>
           <m:t>.03</m:t>
+        </m:r>
+        <m:r>
+          <m:rPr>
+            <m:sty m:val="p"/>
+          </m:rPr>
+          <m:t>]</m:t>
+        </m:r>
+      </m:oMath>
+      <w:r>
+        <w:t xml:space="preserve">, and</w:t>
+      </w:r>
+      <w:r>
+        <w:t xml:space="preserve"> </w:t>
+      </w:r>
+      <m:oMath>
+        <m:r>
+          <m:rPr>
+            <m:sty m:val="p"/>
+          </m:rPr>
+          <m:t>Δ</m:t>
+        </m:r>
+        <m:sSub>
+          <m:e>
+            <m:r>
+              <m:t>N</m:t>
+            </m:r>
+          </m:e>
+          <m:sub>
+            <m:r>
+              <m:t>3</m:t>
+            </m:r>
+          </m:sub>
+        </m:sSub>
+        <m:r>
+          <m:rPr>
+            <m:sty m:val="p"/>
+          </m:rPr>
+          <m:t>=</m:t>
+        </m:r>
+        <m:r>
+          <m:rPr>
+            <m:sty m:val="p"/>
+          </m:rPr>
+          <m:t>[</m:t>
+        </m:r>
+        <m:r>
+          <m:rPr>
+            <m:sty m:val="p"/>
+          </m:rPr>
+          <m:t>−</m:t>
+        </m:r>
+        <m:r>
+          <m:t>.06</m:t>
+        </m:r>
+        <m:r>
+          <m:rPr>
+            <m:sty m:val="p"/>
+          </m:rPr>
+          <m:t>,</m:t>
+        </m:r>
+        <m:r>
+          <m:t>.02</m:t>
         </m:r>
         <m:r>
           <m:rPr>
@@ -2993,7 +3259,7 @@
         </m:r>
       </m:oMath>
       <w:r>
-        <w:t xml:space="preserve">, and</w:t>
+        <w:t xml:space="preserve">,</w:t>
       </w:r>
       <w:r>
         <w:t xml:space="preserve"> </w:t>
@@ -3046,6 +3312,74 @@
         </m:r>
         <m:r>
           <m:t>.02</m:t>
+        </m:r>
+        <m:r>
+          <m:rPr>
+            <m:sty m:val="p"/>
+          </m:rPr>
+          <m:t>]</m:t>
+        </m:r>
+      </m:oMath>
+      <w:r>
+        <w:t xml:space="preserve">, and</w:t>
+      </w:r>
+      <w:r>
+        <w:t xml:space="preserve"> </w:t>
+      </w:r>
+      <m:oMath>
+        <m:r>
+          <m:rPr>
+            <m:sty m:val="p"/>
+          </m:rPr>
+          <m:t>Δ</m:t>
+        </m:r>
+        <m:sSub>
+          <m:e>
+            <m:r>
+              <m:t>N</m:t>
+            </m:r>
+          </m:e>
+          <m:sub>
+            <m:r>
+              <m:t>3</m:t>
+            </m:r>
+          </m:sub>
+        </m:sSub>
+        <m:r>
+          <m:rPr>
+            <m:sty m:val="p"/>
+          </m:rPr>
+          <m:t>=</m:t>
+        </m:r>
+        <m:r>
+          <m:rPr>
+            <m:sty m:val="p"/>
+          </m:rPr>
+          <m:t>[</m:t>
+        </m:r>
+        <m:r>
+          <m:rPr>
+            <m:sty m:val="p"/>
+          </m:rPr>
+          <m:t>−</m:t>
+        </m:r>
+        <m:r>
+          <m:t>.35</m:t>
+        </m:r>
+        <m:r>
+          <m:rPr>
+            <m:sty m:val="p"/>
+          </m:rPr>
+          <m:t>,</m:t>
+        </m:r>
+        <m:r>
+          <m:rPr>
+            <m:sty m:val="p"/>
+          </m:rPr>
+          <m:t>−</m:t>
+        </m:r>
+        <m:r>
+          <m:t>.23</m:t>
         </m:r>
         <m:r>
           <m:rPr>
@@ -3497,7 +3831,7 @@
         </m:r>
       </m:oMath>
       <w:r>
-        <w:t xml:space="preserve">, and</w:t>
+        <w:t xml:space="preserve">,</w:t>
       </w:r>
       <w:r>
         <w:t xml:space="preserve"> </w:t>
@@ -3518,6 +3852,68 @@
           <m:sub>
             <m:r>
               <m:t>2</m:t>
+            </m:r>
+          </m:sub>
+        </m:sSub>
+        <m:r>
+          <m:rPr>
+            <m:sty m:val="p"/>
+          </m:rPr>
+          <m:t>=</m:t>
+        </m:r>
+        <m:r>
+          <m:rPr>
+            <m:sty m:val="p"/>
+          </m:rPr>
+          <m:t>[</m:t>
+        </m:r>
+        <m:r>
+          <m:rPr>
+            <m:sty m:val="p"/>
+          </m:rPr>
+          <m:t>−</m:t>
+        </m:r>
+        <m:r>
+          <m:t>.05</m:t>
+        </m:r>
+        <m:r>
+          <m:rPr>
+            <m:sty m:val="p"/>
+          </m:rPr>
+          <m:t>,</m:t>
+        </m:r>
+        <m:r>
+          <m:t>.03</m:t>
+        </m:r>
+        <m:r>
+          <m:rPr>
+            <m:sty m:val="p"/>
+          </m:rPr>
+          <m:t>]</m:t>
+        </m:r>
+      </m:oMath>
+      <w:r>
+        <w:t xml:space="preserve">, and</w:t>
+      </w:r>
+      <w:r>
+        <w:t xml:space="preserve"> </w:t>
+      </w:r>
+      <m:oMath>
+        <m:r>
+          <m:rPr>
+            <m:sty m:val="p"/>
+          </m:rPr>
+          <m:t>Δ</m:t>
+        </m:r>
+        <m:sSub>
+          <m:e>
+            <m:r>
+              <m:t>N</m:t>
+            </m:r>
+          </m:e>
+          <m:sub>
+            <m:r>
+              <m:t>3</m:t>
             </m:r>
           </m:sub>
         </m:sSub>
@@ -4020,7 +4416,7 @@
         </m:r>
       </m:oMath>
       <w:r>
-        <w:t xml:space="preserve">, and</w:t>
+        <w:t xml:space="preserve">,</w:t>
       </w:r>
       <w:r>
         <w:t xml:space="preserve"> </w:t>
@@ -4073,6 +4469,74 @@
         </m:r>
         <m:r>
           <m:t>.02</m:t>
+        </m:r>
+        <m:r>
+          <m:rPr>
+            <m:sty m:val="p"/>
+          </m:rPr>
+          <m:t>]</m:t>
+        </m:r>
+      </m:oMath>
+      <w:r>
+        <w:t xml:space="preserve">, and</w:t>
+      </w:r>
+      <w:r>
+        <w:t xml:space="preserve"> </w:t>
+      </w:r>
+      <m:oMath>
+        <m:r>
+          <m:rPr>
+            <m:sty m:val="p"/>
+          </m:rPr>
+          <m:t>Δ</m:t>
+        </m:r>
+        <m:sSub>
+          <m:e>
+            <m:r>
+              <m:t>N</m:t>
+            </m:r>
+          </m:e>
+          <m:sub>
+            <m:r>
+              <m:t>3</m:t>
+            </m:r>
+          </m:sub>
+        </m:sSub>
+        <m:r>
+          <m:rPr>
+            <m:sty m:val="p"/>
+          </m:rPr>
+          <m:t>=</m:t>
+        </m:r>
+        <m:r>
+          <m:rPr>
+            <m:sty m:val="p"/>
+          </m:rPr>
+          <m:t>[</m:t>
+        </m:r>
+        <m:r>
+          <m:rPr>
+            <m:sty m:val="p"/>
+          </m:rPr>
+          <m:t>−</m:t>
+        </m:r>
+        <m:r>
+          <m:t>.35</m:t>
+        </m:r>
+        <m:r>
+          <m:rPr>
+            <m:sty m:val="p"/>
+          </m:rPr>
+          <m:t>,</m:t>
+        </m:r>
+        <m:r>
+          <m:rPr>
+            <m:sty m:val="p"/>
+          </m:rPr>
+          <m:t>−</m:t>
+        </m:r>
+        <m:r>
+          <m:t>.23</m:t>
         </m:r>
         <m:r>
           <m:rPr>
@@ -4524,7 +4988,7 @@
         </m:r>
       </m:oMath>
       <w:r>
-        <w:t xml:space="preserve">, and</w:t>
+        <w:t xml:space="preserve">,</w:t>
       </w:r>
       <w:r>
         <w:t xml:space="preserve"> </w:t>
@@ -4577,6 +5041,68 @@
         </m:r>
         <m:r>
           <m:t>.02</m:t>
+        </m:r>
+        <m:r>
+          <m:rPr>
+            <m:sty m:val="p"/>
+          </m:rPr>
+          <m:t>]</m:t>
+        </m:r>
+      </m:oMath>
+      <w:r>
+        <w:t xml:space="preserve">, and</w:t>
+      </w:r>
+      <w:r>
+        <w:t xml:space="preserve"> </w:t>
+      </w:r>
+      <m:oMath>
+        <m:r>
+          <m:rPr>
+            <m:sty m:val="p"/>
+          </m:rPr>
+          <m:t>Δ</m:t>
+        </m:r>
+        <m:sSub>
+          <m:e>
+            <m:r>
+              <m:t>N</m:t>
+            </m:r>
+          </m:e>
+          <m:sub>
+            <m:r>
+              <m:t>3</m:t>
+            </m:r>
+          </m:sub>
+        </m:sSub>
+        <m:r>
+          <m:rPr>
+            <m:sty m:val="p"/>
+          </m:rPr>
+          <m:t>=</m:t>
+        </m:r>
+        <m:r>
+          <m:rPr>
+            <m:sty m:val="p"/>
+          </m:rPr>
+          <m:t>[</m:t>
+        </m:r>
+        <m:r>
+          <m:rPr>
+            <m:sty m:val="p"/>
+          </m:rPr>
+          <m:t>−</m:t>
+        </m:r>
+        <m:r>
+          <m:t>.07</m:t>
+        </m:r>
+        <m:r>
+          <m:rPr>
+            <m:sty m:val="p"/>
+          </m:rPr>
+          <m:t>,</m:t>
+        </m:r>
+        <m:r>
+          <m:t>.01</m:t>
         </m:r>
         <m:r>
           <m:rPr>
@@ -6061,11 +6587,12 @@
         <w:tblLook w:firstRow="1" w:lastRow="0" w:firstColumn="0" w:lastColumn="0" w:noHBand="0" w:noVBand="0" w:val="0020"/>
       </w:tblPr>
       <w:tblGrid>
-        <w:gridCol w:w="2399"/>
-        <w:gridCol w:w="1499"/>
-        <w:gridCol w:w="1499"/>
-        <w:gridCol w:w="1499"/>
-        <w:gridCol w:w="3098"/>
+        <w:gridCol w:w="1799"/>
+        <w:gridCol w:w="1599"/>
+        <w:gridCol w:w="1599"/>
+        <w:gridCol w:w="1599"/>
+        <w:gridCol w:w="1599"/>
+        <w:gridCol w:w="1799"/>
       </w:tblGrid>
       <w:tr>
         <w:trPr>
@@ -6074,13 +6601,13 @@
         </w:trPr>
         <w:tc>
           <w:tcPr>
-            <w:tcW w:w="2399" w:type="dxa"/>
+            <w:tcW w:w="1799" w:type="dxa"/>
             <w:vAlign w:val="center"/>
             <w:tcMar>
-              <w:top w:w="70" w:type="dxa"/>
-              <w:bottom w:w="70" w:type="dxa"/>
-              <w:start w:w="85" w:type="dxa"/>
-              <w:end w:w="85" w:type="dxa"/>
+              <w:top w:w="55" w:type="dxa"/>
+              <w:bottom w:w="55" w:type="dxa"/>
+              <w:start w:w="40" w:type="dxa"/>
+              <w:end w:w="40" w:type="dxa"/>
             </w:tcMar>
             <w:shd w:fill="1B344C" w:val="clear"/>
           </w:tcPr>
@@ -6094,7 +6621,7 @@
                 <w:rFonts w:ascii="Liberation Sans" w:hAnsi="Liberation Sans" w:eastAsia="Liberation Sans" w:cs="Liberation Sans"/>
                 <w:b/>
                 <w:color w:val="FFFFFF"/>
-                <w:sz w:val="18"/>
+                <w:sz w:val="16"/>
               </w:rPr>
               <w:t xml:space="preserve">Synthetic condition</w:t>
             </w:r>
@@ -6102,13 +6629,13 @@
         </w:tc>
         <w:tc>
           <w:tcPr>
-            <w:tcW w:w="1499" w:type="dxa"/>
+            <w:tcW w:w="1599" w:type="dxa"/>
             <w:vAlign w:val="center"/>
             <w:tcMar>
-              <w:top w:w="70" w:type="dxa"/>
-              <w:bottom w:w="70" w:type="dxa"/>
-              <w:start w:w="85" w:type="dxa"/>
-              <w:end w:w="85" w:type="dxa"/>
+              <w:top w:w="55" w:type="dxa"/>
+              <w:bottom w:w="55" w:type="dxa"/>
+              <w:start w:w="40" w:type="dxa"/>
+              <w:end w:w="40" w:type="dxa"/>
             </w:tcMar>
             <w:shd w:fill="1B344C" w:val="clear"/>
           </w:tcPr>
@@ -6123,7 +6650,7 @@
                 <w:rFonts w:ascii="Liberation Sans" w:hAnsi="Liberation Sans" w:eastAsia="Liberation Sans" w:cs="Liberation Sans"/>
                 <w:b/>
                 <w:color w:val="FFFFFF"/>
-                <w:sz w:val="18"/>
+                <w:sz w:val="16"/>
               </w:rPr>
               <w:t>ΔV</w:t>
             </w:r>
@@ -6131,13 +6658,13 @@
         </w:tc>
         <w:tc>
           <w:tcPr>
-            <w:tcW w:w="1499" w:type="dxa"/>
+            <w:tcW w:w="1599" w:type="dxa"/>
             <w:vAlign w:val="center"/>
             <w:tcMar>
-              <w:top w:w="70" w:type="dxa"/>
-              <w:bottom w:w="70" w:type="dxa"/>
-              <w:start w:w="85" w:type="dxa"/>
-              <w:end w:w="85" w:type="dxa"/>
+              <w:top w:w="55" w:type="dxa"/>
+              <w:bottom w:w="55" w:type="dxa"/>
+              <w:start w:w="40" w:type="dxa"/>
+              <w:end w:w="40" w:type="dxa"/>
             </w:tcMar>
             <w:shd w:fill="1B344C" w:val="clear"/>
           </w:tcPr>
@@ -6152,7 +6679,7 @@
                 <w:rFonts w:ascii="Liberation Sans" w:hAnsi="Liberation Sans" w:eastAsia="Liberation Sans" w:cs="Liberation Sans"/>
                 <w:b/>
                 <w:color w:val="FFFFFF"/>
-                <w:sz w:val="18"/>
+                <w:sz w:val="16"/>
               </w:rPr>
               <w:t>ΔN₁</w:t>
             </w:r>
@@ -6160,13 +6687,13 @@
         </w:tc>
         <w:tc>
           <w:tcPr>
-            <w:tcW w:w="1499" w:type="dxa"/>
+            <w:tcW w:w="1599" w:type="dxa"/>
             <w:vAlign w:val="center"/>
             <w:tcMar>
-              <w:top w:w="70" w:type="dxa"/>
-              <w:bottom w:w="70" w:type="dxa"/>
-              <w:start w:w="85" w:type="dxa"/>
-              <w:end w:w="85" w:type="dxa"/>
+              <w:top w:w="55" w:type="dxa"/>
+              <w:bottom w:w="55" w:type="dxa"/>
+              <w:start w:w="40" w:type="dxa"/>
+              <w:end w:w="40" w:type="dxa"/>
             </w:tcMar>
             <w:shd w:fill="1B344C" w:val="clear"/>
           </w:tcPr>
@@ -6181,7 +6708,7 @@
                 <w:rFonts w:ascii="Liberation Sans" w:hAnsi="Liberation Sans" w:eastAsia="Liberation Sans" w:cs="Liberation Sans"/>
                 <w:b/>
                 <w:color w:val="FFFFFF"/>
-                <w:sz w:val="18"/>
+                <w:sz w:val="16"/>
               </w:rPr>
               <w:t>ΔN₂</w:t>
             </w:r>
@@ -6189,13 +6716,13 @@
         </w:tc>
         <w:tc>
           <w:tcPr>
-            <w:tcW w:w="3098" w:type="dxa"/>
+            <w:tcW w:w="1599" w:type="dxa"/>
             <w:vAlign w:val="center"/>
             <w:tcMar>
-              <w:top w:w="70" w:type="dxa"/>
-              <w:bottom w:w="70" w:type="dxa"/>
-              <w:start w:w="85" w:type="dxa"/>
-              <w:end w:w="85" w:type="dxa"/>
+              <w:top w:w="55" w:type="dxa"/>
+              <w:bottom w:w="55" w:type="dxa"/>
+              <w:start w:w="40" w:type="dxa"/>
+              <w:end w:w="40" w:type="dxa"/>
             </w:tcMar>
             <w:shd w:fill="1B344C" w:val="clear"/>
           </w:tcPr>
@@ -6210,25 +6737,54 @@
                 <w:rFonts w:ascii="Liberation Sans" w:hAnsi="Liberation Sans" w:eastAsia="Liberation Sans" w:cs="Liberation Sans"/>
                 <w:b/>
                 <w:color w:val="FFFFFF"/>
-                <w:sz w:val="18"/>
-              </w:rPr>
-              <w:t>R_C</w:t>
-            </w:r>
+                <w:sz w:val="16"/>
+              </w:rPr>
+              <w:t>ΔN₃</w:t>
+            </w:r>
+          </w:p>
+        </w:tc>
+        <w:tc>
+          <w:tcPr>
+            <w:tcW w:w="1799" w:type="dxa"/>
+            <w:vAlign w:val="center"/>
+            <w:tcMar>
+              <w:top w:w="55" w:type="dxa"/>
+              <w:bottom w:w="55" w:type="dxa"/>
+              <w:start w:w="40" w:type="dxa"/>
+              <w:end w:w="40" w:type="dxa"/>
+            </w:tcMar>
+            <w:shd w:fill="1B344C" w:val="clear"/>
+          </w:tcPr>
+          <w:p>
+            <w:pPr>
+              <w:pStyle w:val="Compact"/>
+              <w:spacing w:before="0" w:after="40" w:line="240" w:lineRule="auto"/>
+              <w:jc w:val="center"/>
+            </w:pPr>
             <w:r>
               <w:rPr>
                 <w:rFonts w:ascii="Liberation Sans" w:hAnsi="Liberation Sans" w:eastAsia="Liberation Sans" w:cs="Liberation Sans"/>
                 <w:b/>
                 <w:color w:val="FFFFFF"/>
-                <w:sz w:val="18"/>
-              </w:rPr>
-              <w:t xml:space="preserve"> </w:t>
+                <w:sz w:val="16"/>
+              </w:rPr>
+              <w:t>R_C</w:t>
             </w:r>
             <w:r>
               <w:rPr>
                 <w:rFonts w:ascii="Liberation Sans" w:hAnsi="Liberation Sans" w:eastAsia="Liberation Sans" w:cs="Liberation Sans"/>
                 <w:b/>
                 <w:color w:val="FFFFFF"/>
-                <w:sz w:val="18"/>
+                <w:sz w:val="16"/>
+              </w:rPr>
+              <w:t xml:space="preserve"> </w:t>
+            </w:r>
+            <w:r>
+              <w:rPr>
+                <w:rFonts w:ascii="Liberation Sans" w:hAnsi="Liberation Sans" w:eastAsia="Liberation Sans" w:cs="Liberation Sans"/>
+                <w:b/>
+                <w:color w:val="FFFFFF"/>
+                <w:sz w:val="16"/>
               </w:rPr>
               <w:t xml:space="preserve">/ mapping status</w:t>
             </w:r>
@@ -6241,13 +6797,13 @@
         </w:trPr>
         <w:tc>
           <w:tcPr>
-            <w:tcW w:w="2399" w:type="dxa"/>
+            <w:tcW w:w="1799" w:type="dxa"/>
             <w:vAlign w:val="center"/>
             <w:tcMar>
-              <w:top w:w="70" w:type="dxa"/>
-              <w:bottom w:w="70" w:type="dxa"/>
-              <w:start w:w="85" w:type="dxa"/>
-              <w:end w:w="85" w:type="dxa"/>
+              <w:top w:w="55" w:type="dxa"/>
+              <w:bottom w:w="55" w:type="dxa"/>
+              <w:start w:w="40" w:type="dxa"/>
+              <w:end w:w="40" w:type="dxa"/>
             </w:tcMar>
             <w:shd w:fill="FFFFFF" w:val="clear"/>
           </w:tcPr>
@@ -6260,7 +6816,7 @@
               <w:rPr>
                 <w:rFonts w:ascii="Liberation Sans" w:hAnsi="Liberation Sans" w:eastAsia="Liberation Sans" w:cs="Liberation Sans"/>
                 <w:color w:val="232A30"/>
-                <w:sz w:val="18"/>
+                <w:sz w:val="16"/>
               </w:rPr>
               <w:t xml:space="preserve">Early interruption</w:t>
             </w:r>
@@ -6268,13 +6824,13 @@
         </w:tc>
         <w:tc>
           <w:tcPr>
-            <w:tcW w:w="1499" w:type="dxa"/>
+            <w:tcW w:w="1599" w:type="dxa"/>
             <w:vAlign w:val="center"/>
             <w:tcMar>
-              <w:top w:w="70" w:type="dxa"/>
-              <w:bottom w:w="70" w:type="dxa"/>
-              <w:start w:w="85" w:type="dxa"/>
-              <w:end w:w="85" w:type="dxa"/>
+              <w:top w:w="55" w:type="dxa"/>
+              <w:bottom w:w="55" w:type="dxa"/>
+              <w:start w:w="40" w:type="dxa"/>
+              <w:end w:w="40" w:type="dxa"/>
             </w:tcMar>
             <w:shd w:fill="FFFFFF" w:val="clear"/>
           </w:tcPr>
@@ -6284,79 +6840,25 @@
               <w:spacing w:before="0" w:after="40" w:line="240" w:lineRule="auto"/>
               <w:jc w:val="center"/>
             </w:pPr>
-            <m:oMath>
-              <m:r>
-                <m:rPr>
-                  <m:sty m:val="p"/>
-                </m:rPr>
-                <w:rPr>
-                  <w:sz w:val="18"/>
-                  <w:szCs w:val="18"/>
-                  <w:color w:val="232A30"/>
-                </w:rPr>
-                <m:t>[</m:t>
-              </m:r>
-              <m:r>
-                <m:rPr>
-                  <m:sty m:val="p"/>
-                </m:rPr>
-                <w:rPr>
-                  <w:sz w:val="18"/>
-                  <w:szCs w:val="18"/>
-                  <w:color w:val="232A30"/>
-                </w:rPr>
-                <m:t>−</m:t>
-              </m:r>
-              <m:r>
-                <w:rPr>
-                  <w:sz w:val="18"/>
-                  <w:szCs w:val="18"/>
-                  <w:color w:val="232A30"/>
-                </w:rPr>
-                <m:t>.04</m:t>
-              </m:r>
-              <m:r>
-                <m:rPr>
-                  <m:sty m:val="p"/>
-                </m:rPr>
-                <w:rPr>
-                  <w:sz w:val="18"/>
-                  <w:szCs w:val="18"/>
-                  <w:color w:val="232A30"/>
-                </w:rPr>
-                <m:t>,</m:t>
-              </m:r>
-              <m:r>
-                <w:rPr>
-                  <w:sz w:val="18"/>
-                  <w:szCs w:val="18"/>
-                  <w:color w:val="232A30"/>
-                </w:rPr>
-                <m:t>.02</m:t>
-              </m:r>
-              <m:r>
-                <m:rPr>
-                  <m:sty m:val="p"/>
-                </m:rPr>
-                <w:rPr>
-                  <w:sz w:val="18"/>
-                  <w:szCs w:val="18"/>
-                  <w:color w:val="232A30"/>
-                </w:rPr>
-                <m:t>]</m:t>
-              </m:r>
-            </m:oMath>
+            <w:r>
+              <w:rPr>
+                <w:rFonts w:ascii="Liberation Sans" w:hAnsi="Liberation Sans" w:eastAsia="Liberation Sans" w:cs="Liberation Sans"/>
+                <w:color w:val="232A30"/>
+                <w:sz w:val="16"/>
+              </w:rPr>
+              <w:t>[−.04,.02]</w:t>
+            </w:r>
           </w:p>
         </w:tc>
         <w:tc>
           <w:tcPr>
-            <w:tcW w:w="1499" w:type="dxa"/>
+            <w:tcW w:w="1599" w:type="dxa"/>
             <w:vAlign w:val="center"/>
             <w:tcMar>
-              <w:top w:w="70" w:type="dxa"/>
-              <w:bottom w:w="70" w:type="dxa"/>
-              <w:start w:w="85" w:type="dxa"/>
-              <w:end w:w="85" w:type="dxa"/>
+              <w:top w:w="55" w:type="dxa"/>
+              <w:bottom w:w="55" w:type="dxa"/>
+              <w:start w:w="40" w:type="dxa"/>
+              <w:end w:w="40" w:type="dxa"/>
             </w:tcMar>
             <w:shd w:fill="FFFFFF" w:val="clear"/>
           </w:tcPr>
@@ -6366,90 +6868,25 @@
               <w:spacing w:before="0" w:after="40" w:line="240" w:lineRule="auto"/>
               <w:jc w:val="center"/>
             </w:pPr>
-            <m:oMath>
-              <m:r>
-                <m:rPr>
-                  <m:sty m:val="p"/>
-                </m:rPr>
-                <w:rPr>
-                  <w:sz w:val="18"/>
-                  <w:szCs w:val="18"/>
-                  <w:color w:val="232A30"/>
-                </w:rPr>
-                <m:t>[</m:t>
-              </m:r>
-              <m:r>
-                <m:rPr>
-                  <m:sty m:val="p"/>
-                </m:rPr>
-                <w:rPr>
-                  <w:sz w:val="18"/>
-                  <w:szCs w:val="18"/>
-                  <w:color w:val="232A30"/>
-                </w:rPr>
-                <m:t>−</m:t>
-              </m:r>
-              <m:r>
-                <w:rPr>
-                  <w:sz w:val="18"/>
-                  <w:szCs w:val="18"/>
-                  <w:color w:val="232A30"/>
-                </w:rPr>
-                <m:t>.29</m:t>
-              </m:r>
-              <m:r>
-                <m:rPr>
-                  <m:sty m:val="p"/>
-                </m:rPr>
-                <w:rPr>
-                  <w:sz w:val="18"/>
-                  <w:szCs w:val="18"/>
-                  <w:color w:val="232A30"/>
-                </w:rPr>
-                <m:t>,</m:t>
-              </m:r>
-              <m:r>
-                <m:rPr>
-                  <m:sty m:val="p"/>
-                </m:rPr>
-                <w:rPr>
-                  <w:sz w:val="18"/>
-                  <w:szCs w:val="18"/>
-                  <w:color w:val="232A30"/>
-                </w:rPr>
-                <m:t>−</m:t>
-              </m:r>
-              <m:r>
-                <w:rPr>
-                  <w:sz w:val="18"/>
-                  <w:szCs w:val="18"/>
-                  <w:color w:val="232A30"/>
-                </w:rPr>
-                <m:t>.15</m:t>
-              </m:r>
-              <m:r>
-                <m:rPr>
-                  <m:sty m:val="p"/>
-                </m:rPr>
-                <w:rPr>
-                  <w:sz w:val="18"/>
-                  <w:szCs w:val="18"/>
-                  <w:color w:val="232A30"/>
-                </w:rPr>
-                <m:t>]</m:t>
-              </m:r>
-            </m:oMath>
+            <w:r>
+              <w:rPr>
+                <w:rFonts w:ascii="Liberation Sans" w:hAnsi="Liberation Sans" w:eastAsia="Liberation Sans" w:cs="Liberation Sans"/>
+                <w:color w:val="232A30"/>
+                <w:sz w:val="16"/>
+              </w:rPr>
+              <w:t>[−.29,−.15]</w:t>
+            </w:r>
           </w:p>
         </w:tc>
         <w:tc>
           <w:tcPr>
-            <w:tcW w:w="1499" w:type="dxa"/>
+            <w:tcW w:w="1599" w:type="dxa"/>
             <w:vAlign w:val="center"/>
             <w:tcMar>
-              <w:top w:w="70" w:type="dxa"/>
-              <w:bottom w:w="70" w:type="dxa"/>
-              <w:start w:w="85" w:type="dxa"/>
-              <w:end w:w="85" w:type="dxa"/>
+              <w:top w:w="55" w:type="dxa"/>
+              <w:bottom w:w="55" w:type="dxa"/>
+              <w:start w:w="40" w:type="dxa"/>
+              <w:end w:w="40" w:type="dxa"/>
             </w:tcMar>
             <w:shd w:fill="FFFFFF" w:val="clear"/>
           </w:tcPr>
@@ -6459,90 +6896,25 @@
               <w:spacing w:before="0" w:after="40" w:line="240" w:lineRule="auto"/>
               <w:jc w:val="center"/>
             </w:pPr>
-            <m:oMath>
-              <m:r>
-                <m:rPr>
-                  <m:sty m:val="p"/>
-                </m:rPr>
-                <w:rPr>
-                  <w:sz w:val="18"/>
-                  <w:szCs w:val="18"/>
-                  <w:color w:val="232A30"/>
-                </w:rPr>
-                <m:t>[</m:t>
-              </m:r>
-              <m:r>
-                <m:rPr>
-                  <m:sty m:val="p"/>
-                </m:rPr>
-                <w:rPr>
-                  <w:sz w:val="18"/>
-                  <w:szCs w:val="18"/>
-                  <w:color w:val="232A30"/>
-                </w:rPr>
-                <m:t>−</m:t>
-              </m:r>
-              <m:r>
-                <w:rPr>
-                  <w:sz w:val="18"/>
-                  <w:szCs w:val="18"/>
-                  <w:color w:val="232A30"/>
-                </w:rPr>
-                <m:t>.28</m:t>
-              </m:r>
-              <m:r>
-                <m:rPr>
-                  <m:sty m:val="p"/>
-                </m:rPr>
-                <w:rPr>
-                  <w:sz w:val="18"/>
-                  <w:szCs w:val="18"/>
-                  <w:color w:val="232A30"/>
-                </w:rPr>
-                <m:t>,</m:t>
-              </m:r>
-              <m:r>
-                <m:rPr>
-                  <m:sty m:val="p"/>
-                </m:rPr>
-                <w:rPr>
-                  <w:sz w:val="18"/>
-                  <w:szCs w:val="18"/>
-                  <w:color w:val="232A30"/>
-                </w:rPr>
-                <m:t>−</m:t>
-              </m:r>
-              <m:r>
-                <w:rPr>
-                  <w:sz w:val="18"/>
-                  <w:szCs w:val="18"/>
-                  <w:color w:val="232A30"/>
-                </w:rPr>
-                <m:t>.16</m:t>
-              </m:r>
-              <m:r>
-                <m:rPr>
-                  <m:sty m:val="p"/>
-                </m:rPr>
-                <w:rPr>
-                  <w:sz w:val="18"/>
-                  <w:szCs w:val="18"/>
-                  <w:color w:val="232A30"/>
-                </w:rPr>
-                <m:t>]</m:t>
-              </m:r>
-            </m:oMath>
+            <w:r>
+              <w:rPr>
+                <w:rFonts w:ascii="Liberation Sans" w:hAnsi="Liberation Sans" w:eastAsia="Liberation Sans" w:cs="Liberation Sans"/>
+                <w:color w:val="232A30"/>
+                <w:sz w:val="16"/>
+              </w:rPr>
+              <w:t>[−.28,−.16]</w:t>
+            </w:r>
           </w:p>
         </w:tc>
         <w:tc>
           <w:tcPr>
-            <w:tcW w:w="3098" w:type="dxa"/>
+            <w:tcW w:w="1599" w:type="dxa"/>
             <w:vAlign w:val="center"/>
             <w:tcMar>
-              <w:top w:w="70" w:type="dxa"/>
-              <w:bottom w:w="70" w:type="dxa"/>
-              <w:start w:w="85" w:type="dxa"/>
-              <w:end w:w="85" w:type="dxa"/>
+              <w:top w:w="55" w:type="dxa"/>
+              <w:bottom w:w="55" w:type="dxa"/>
+              <w:start w:w="40" w:type="dxa"/>
+              <w:end w:w="40" w:type="dxa"/>
             </w:tcMar>
             <w:shd w:fill="FFFFFF" w:val="clear"/>
           </w:tcPr>
@@ -6552,21 +6924,47 @@
               <w:spacing w:before="0" w:after="40" w:line="240" w:lineRule="auto"/>
               <w:jc w:val="center"/>
             </w:pPr>
-            <m:oMath>
-              <m:r>
-                <w:rPr>
-                  <w:sz w:val="18"/>
-                  <w:szCs w:val="18"/>
-                  <w:color w:val="232A30"/>
-                </w:rPr>
-                <m:t>.88</m:t>
-              </m:r>
-            </m:oMath>
             <w:r>
               <w:rPr>
                 <w:rFonts w:ascii="Liberation Sans" w:hAnsi="Liberation Sans" w:eastAsia="Liberation Sans" w:cs="Liberation Sans"/>
                 <w:color w:val="232A30"/>
-                <w:sz w:val="18"/>
+                <w:sz w:val="16"/>
+              </w:rPr>
+              <w:t>[−.43,−.31]</w:t>
+            </w:r>
+          </w:p>
+        </w:tc>
+        <w:tc>
+          <w:tcPr>
+            <w:tcW w:w="1799" w:type="dxa"/>
+            <w:vAlign w:val="center"/>
+            <w:tcMar>
+              <w:top w:w="55" w:type="dxa"/>
+              <w:bottom w:w="55" w:type="dxa"/>
+              <w:start w:w="40" w:type="dxa"/>
+              <w:end w:w="40" w:type="dxa"/>
+            </w:tcMar>
+            <w:shd w:fill="FFFFFF" w:val="clear"/>
+          </w:tcPr>
+          <w:p>
+            <w:pPr>
+              <w:pStyle w:val="Compact"/>
+              <w:spacing w:before="0" w:after="40" w:line="240" w:lineRule="auto"/>
+              <w:jc w:val="center"/>
+            </w:pPr>
+            <w:r>
+              <w:rPr>
+                <w:rFonts w:ascii="Liberation Sans" w:hAnsi="Liberation Sans" w:eastAsia="Liberation Sans" w:cs="Liberation Sans"/>
+                <w:color w:val="232A30"/>
+                <w:sz w:val="16"/>
+              </w:rPr>
+              <w:t>.88</w:t>
+            </w:r>
+            <w:r>
+              <w:rPr>
+                <w:rFonts w:ascii="Liberation Sans" w:hAnsi="Liberation Sans" w:eastAsia="Liberation Sans" w:cs="Liberation Sans"/>
+                <w:color w:val="232A30"/>
+                <w:sz w:val="16"/>
               </w:rPr>
               <w:t xml:space="preserve"> </w:t>
             </w:r>
@@ -6574,7 +6972,7 @@
               <w:rPr>
                 <w:rFonts w:ascii="Liberation Sans" w:hAnsi="Liberation Sans" w:eastAsia="Liberation Sans" w:cs="Liberation Sans"/>
                 <w:color w:val="232A30"/>
-                <w:sz w:val="18"/>
+                <w:sz w:val="16"/>
               </w:rPr>
               <w:t xml:space="preserve">/ pass</w:t>
             </w:r>
@@ -6587,13 +6985,13 @@
         </w:trPr>
         <w:tc>
           <w:tcPr>
-            <w:tcW w:w="2399" w:type="dxa"/>
+            <w:tcW w:w="1799" w:type="dxa"/>
             <w:vAlign w:val="center"/>
             <w:tcMar>
-              <w:top w:w="70" w:type="dxa"/>
-              <w:bottom w:w="70" w:type="dxa"/>
-              <w:start w:w="85" w:type="dxa"/>
-              <w:end w:w="85" w:type="dxa"/>
+              <w:top w:w="55" w:type="dxa"/>
+              <w:bottom w:w="55" w:type="dxa"/>
+              <w:start w:w="40" w:type="dxa"/>
+              <w:end w:w="40" w:type="dxa"/>
             </w:tcMar>
             <w:shd w:fill="F4F6F7" w:val="clear"/>
           </w:tcPr>
@@ -6606,7 +7004,7 @@
               <w:rPr>
                 <w:rFonts w:ascii="Liberation Sans" w:hAnsi="Liberation Sans" w:eastAsia="Liberation Sans" w:cs="Liberation Sans"/>
                 <w:color w:val="232A30"/>
-                <w:sz w:val="18"/>
+                <w:sz w:val="16"/>
               </w:rPr>
               <w:t xml:space="preserve">Target return-path cut</w:t>
             </w:r>
@@ -6614,13 +7012,13 @@
         </w:tc>
         <w:tc>
           <w:tcPr>
-            <w:tcW w:w="1499" w:type="dxa"/>
+            <w:tcW w:w="1599" w:type="dxa"/>
             <w:vAlign w:val="center"/>
             <w:tcMar>
-              <w:top w:w="70" w:type="dxa"/>
-              <w:bottom w:w="70" w:type="dxa"/>
-              <w:start w:w="85" w:type="dxa"/>
-              <w:end w:w="85" w:type="dxa"/>
+              <w:top w:w="55" w:type="dxa"/>
+              <w:bottom w:w="55" w:type="dxa"/>
+              <w:start w:w="40" w:type="dxa"/>
+              <w:end w:w="40" w:type="dxa"/>
             </w:tcMar>
             <w:shd w:fill="F4F6F7" w:val="clear"/>
           </w:tcPr>
@@ -6630,79 +7028,25 @@
               <w:spacing w:before="0" w:after="40" w:line="240" w:lineRule="auto"/>
               <w:jc w:val="center"/>
             </w:pPr>
-            <m:oMath>
-              <m:r>
-                <m:rPr>
-                  <m:sty m:val="p"/>
-                </m:rPr>
-                <w:rPr>
-                  <w:sz w:val="18"/>
-                  <w:szCs w:val="18"/>
-                  <w:color w:val="232A30"/>
-                </w:rPr>
-                <m:t>[</m:t>
-              </m:r>
-              <m:r>
-                <m:rPr>
-                  <m:sty m:val="p"/>
-                </m:rPr>
-                <w:rPr>
-                  <w:sz w:val="18"/>
-                  <w:szCs w:val="18"/>
-                  <w:color w:val="232A30"/>
-                </w:rPr>
-                <m:t>−</m:t>
-              </m:r>
-              <m:r>
-                <w:rPr>
-                  <w:sz w:val="18"/>
-                  <w:szCs w:val="18"/>
-                  <w:color w:val="232A30"/>
-                </w:rPr>
-                <m:t>.04</m:t>
-              </m:r>
-              <m:r>
-                <m:rPr>
-                  <m:sty m:val="p"/>
-                </m:rPr>
-                <w:rPr>
-                  <w:sz w:val="18"/>
-                  <w:szCs w:val="18"/>
-                  <w:color w:val="232A30"/>
-                </w:rPr>
-                <m:t>,</m:t>
-              </m:r>
-              <m:r>
-                <w:rPr>
-                  <w:sz w:val="18"/>
-                  <w:szCs w:val="18"/>
-                  <w:color w:val="232A30"/>
-                </w:rPr>
-                <m:t>.02</m:t>
-              </m:r>
-              <m:r>
-                <m:rPr>
-                  <m:sty m:val="p"/>
-                </m:rPr>
-                <w:rPr>
-                  <w:sz w:val="18"/>
-                  <w:szCs w:val="18"/>
-                  <w:color w:val="232A30"/>
-                </w:rPr>
-                <m:t>]</m:t>
-              </m:r>
-            </m:oMath>
+            <w:r>
+              <w:rPr>
+                <w:rFonts w:ascii="Liberation Sans" w:hAnsi="Liberation Sans" w:eastAsia="Liberation Sans" w:cs="Liberation Sans"/>
+                <w:color w:val="232A30"/>
+                <w:sz w:val="16"/>
+              </w:rPr>
+              <w:t>[−.04,.02]</w:t>
+            </w:r>
           </w:p>
         </w:tc>
         <w:tc>
           <w:tcPr>
-            <w:tcW w:w="1499" w:type="dxa"/>
+            <w:tcW w:w="1599" w:type="dxa"/>
             <w:vAlign w:val="center"/>
             <w:tcMar>
-              <w:top w:w="70" w:type="dxa"/>
-              <w:bottom w:w="70" w:type="dxa"/>
-              <w:start w:w="85" w:type="dxa"/>
-              <w:end w:w="85" w:type="dxa"/>
+              <w:top w:w="55" w:type="dxa"/>
+              <w:bottom w:w="55" w:type="dxa"/>
+              <w:start w:w="40" w:type="dxa"/>
+              <w:end w:w="40" w:type="dxa"/>
             </w:tcMar>
             <w:shd w:fill="F4F6F7" w:val="clear"/>
           </w:tcPr>
@@ -6712,79 +7056,25 @@
               <w:spacing w:before="0" w:after="40" w:line="240" w:lineRule="auto"/>
               <w:jc w:val="center"/>
             </w:pPr>
-            <m:oMath>
-              <m:r>
-                <m:rPr>
-                  <m:sty m:val="p"/>
-                </m:rPr>
-                <w:rPr>
-                  <w:sz w:val="18"/>
-                  <w:szCs w:val="18"/>
-                  <w:color w:val="232A30"/>
-                </w:rPr>
-                <m:t>[</m:t>
-              </m:r>
-              <m:r>
-                <m:rPr>
-                  <m:sty m:val="p"/>
-                </m:rPr>
-                <w:rPr>
-                  <w:sz w:val="18"/>
-                  <w:szCs w:val="18"/>
-                  <w:color w:val="232A30"/>
-                </w:rPr>
-                <m:t>−</m:t>
-              </m:r>
-              <m:r>
-                <w:rPr>
-                  <w:sz w:val="18"/>
-                  <w:szCs w:val="18"/>
-                  <w:color w:val="232A30"/>
-                </w:rPr>
-                <m:t>.06</m:t>
-              </m:r>
-              <m:r>
-                <m:rPr>
-                  <m:sty m:val="p"/>
-                </m:rPr>
-                <w:rPr>
-                  <w:sz w:val="18"/>
-                  <w:szCs w:val="18"/>
-                  <w:color w:val="232A30"/>
-                </w:rPr>
-                <m:t>,</m:t>
-              </m:r>
-              <m:r>
-                <w:rPr>
-                  <w:sz w:val="18"/>
-                  <w:szCs w:val="18"/>
-                  <w:color w:val="232A30"/>
-                </w:rPr>
-                <m:t>.02</m:t>
-              </m:r>
-              <m:r>
-                <m:rPr>
-                  <m:sty m:val="p"/>
-                </m:rPr>
-                <w:rPr>
-                  <w:sz w:val="18"/>
-                  <w:szCs w:val="18"/>
-                  <w:color w:val="232A30"/>
-                </w:rPr>
-                <m:t>]</m:t>
-              </m:r>
-            </m:oMath>
+            <w:r>
+              <w:rPr>
+                <w:rFonts w:ascii="Liberation Sans" w:hAnsi="Liberation Sans" w:eastAsia="Liberation Sans" w:cs="Liberation Sans"/>
+                <w:color w:val="232A30"/>
+                <w:sz w:val="16"/>
+              </w:rPr>
+              <w:t>[−.06,.02]</w:t>
+            </w:r>
           </w:p>
         </w:tc>
         <w:tc>
           <w:tcPr>
-            <w:tcW w:w="1499" w:type="dxa"/>
+            <w:tcW w:w="1599" w:type="dxa"/>
             <w:vAlign w:val="center"/>
             <w:tcMar>
-              <w:top w:w="70" w:type="dxa"/>
-              <w:bottom w:w="70" w:type="dxa"/>
-              <w:start w:w="85" w:type="dxa"/>
-              <w:end w:w="85" w:type="dxa"/>
+              <w:top w:w="55" w:type="dxa"/>
+              <w:bottom w:w="55" w:type="dxa"/>
+              <w:start w:w="40" w:type="dxa"/>
+              <w:end w:w="40" w:type="dxa"/>
             </w:tcMar>
             <w:shd w:fill="F4F6F7" w:val="clear"/>
           </w:tcPr>
@@ -6794,79 +7084,25 @@
               <w:spacing w:before="0" w:after="40" w:line="240" w:lineRule="auto"/>
               <w:jc w:val="center"/>
             </w:pPr>
-            <m:oMath>
-              <m:r>
-                <m:rPr>
-                  <m:sty m:val="p"/>
-                </m:rPr>
-                <w:rPr>
-                  <w:sz w:val="18"/>
-                  <w:szCs w:val="18"/>
-                  <w:color w:val="232A30"/>
-                </w:rPr>
-                <m:t>[</m:t>
-              </m:r>
-              <m:r>
-                <m:rPr>
-                  <m:sty m:val="p"/>
-                </m:rPr>
-                <w:rPr>
-                  <w:sz w:val="18"/>
-                  <w:szCs w:val="18"/>
-                  <w:color w:val="232A30"/>
-                </w:rPr>
-                <m:t>−</m:t>
-              </m:r>
-              <m:r>
-                <w:rPr>
-                  <w:sz w:val="18"/>
-                  <w:szCs w:val="18"/>
-                  <w:color w:val="232A30"/>
-                </w:rPr>
-                <m:t>.06</m:t>
-              </m:r>
-              <m:r>
-                <m:rPr>
-                  <m:sty m:val="p"/>
-                </m:rPr>
-                <w:rPr>
-                  <w:sz w:val="18"/>
-                  <w:szCs w:val="18"/>
-                  <w:color w:val="232A30"/>
-                </w:rPr>
-                <m:t>,</m:t>
-              </m:r>
-              <m:r>
-                <w:rPr>
-                  <w:sz w:val="18"/>
-                  <w:szCs w:val="18"/>
-                  <w:color w:val="232A30"/>
-                </w:rPr>
-                <m:t>.02</m:t>
-              </m:r>
-              <m:r>
-                <m:rPr>
-                  <m:sty m:val="p"/>
-                </m:rPr>
-                <w:rPr>
-                  <w:sz w:val="18"/>
-                  <w:szCs w:val="18"/>
-                  <w:color w:val="232A30"/>
-                </w:rPr>
-                <m:t>]</m:t>
-              </m:r>
-            </m:oMath>
+            <w:r>
+              <w:rPr>
+                <w:rFonts w:ascii="Liberation Sans" w:hAnsi="Liberation Sans" w:eastAsia="Liberation Sans" w:cs="Liberation Sans"/>
+                <w:color w:val="232A30"/>
+                <w:sz w:val="16"/>
+              </w:rPr>
+              <w:t>[−.06,.02]</w:t>
+            </w:r>
           </w:p>
         </w:tc>
         <w:tc>
           <w:tcPr>
-            <w:tcW w:w="3098" w:type="dxa"/>
+            <w:tcW w:w="1599" w:type="dxa"/>
             <w:vAlign w:val="center"/>
             <w:tcMar>
-              <w:top w:w="70" w:type="dxa"/>
-              <w:bottom w:w="70" w:type="dxa"/>
-              <w:start w:w="85" w:type="dxa"/>
-              <w:end w:w="85" w:type="dxa"/>
+              <w:top w:w="55" w:type="dxa"/>
+              <w:bottom w:w="55" w:type="dxa"/>
+              <w:start w:w="40" w:type="dxa"/>
+              <w:end w:w="40" w:type="dxa"/>
             </w:tcMar>
             <w:shd w:fill="F4F6F7" w:val="clear"/>
           </w:tcPr>
@@ -6876,21 +7112,47 @@
               <w:spacing w:before="0" w:after="40" w:line="240" w:lineRule="auto"/>
               <w:jc w:val="center"/>
             </w:pPr>
-            <m:oMath>
-              <m:r>
-                <w:rPr>
-                  <w:sz w:val="18"/>
-                  <w:szCs w:val="18"/>
-                  <w:color w:val="232A30"/>
-                </w:rPr>
-                <m:t>.90</m:t>
-              </m:r>
-            </m:oMath>
             <w:r>
               <w:rPr>
                 <w:rFonts w:ascii="Liberation Sans" w:hAnsi="Liberation Sans" w:eastAsia="Liberation Sans" w:cs="Liberation Sans"/>
                 <w:color w:val="232A30"/>
-                <w:sz w:val="18"/>
+                <w:sz w:val="16"/>
+              </w:rPr>
+              <w:t>[−.35,−.23]</w:t>
+            </w:r>
+          </w:p>
+        </w:tc>
+        <w:tc>
+          <w:tcPr>
+            <w:tcW w:w="1799" w:type="dxa"/>
+            <w:vAlign w:val="center"/>
+            <w:tcMar>
+              <w:top w:w="55" w:type="dxa"/>
+              <w:bottom w:w="55" w:type="dxa"/>
+              <w:start w:w="40" w:type="dxa"/>
+              <w:end w:w="40" w:type="dxa"/>
+            </w:tcMar>
+            <w:shd w:fill="F4F6F7" w:val="clear"/>
+          </w:tcPr>
+          <w:p>
+            <w:pPr>
+              <w:pStyle w:val="Compact"/>
+              <w:spacing w:before="0" w:after="40" w:line="240" w:lineRule="auto"/>
+              <w:jc w:val="center"/>
+            </w:pPr>
+            <w:r>
+              <w:rPr>
+                <w:rFonts w:ascii="Liberation Sans" w:hAnsi="Liberation Sans" w:eastAsia="Liberation Sans" w:cs="Liberation Sans"/>
+                <w:color w:val="232A30"/>
+                <w:sz w:val="16"/>
+              </w:rPr>
+              <w:t>.90</w:t>
+            </w:r>
+            <w:r>
+              <w:rPr>
+                <w:rFonts w:ascii="Liberation Sans" w:hAnsi="Liberation Sans" w:eastAsia="Liberation Sans" w:cs="Liberation Sans"/>
+                <w:color w:val="232A30"/>
+                <w:sz w:val="16"/>
               </w:rPr>
               <w:t xml:space="preserve"> </w:t>
             </w:r>
@@ -6898,7 +7160,7 @@
               <w:rPr>
                 <w:rFonts w:ascii="Liberation Sans" w:hAnsi="Liberation Sans" w:eastAsia="Liberation Sans" w:cs="Liberation Sans"/>
                 <w:color w:val="232A30"/>
-                <w:sz w:val="18"/>
+                <w:sz w:val="16"/>
               </w:rPr>
               <w:t xml:space="preserve">/ pass</w:t>
             </w:r>
@@ -6911,13 +7173,13 @@
         </w:trPr>
         <w:tc>
           <w:tcPr>
-            <w:tcW w:w="2399" w:type="dxa"/>
+            <w:tcW w:w="1799" w:type="dxa"/>
             <w:vAlign w:val="center"/>
             <w:tcMar>
-              <w:top w:w="70" w:type="dxa"/>
-              <w:bottom w:w="70" w:type="dxa"/>
-              <w:start w:w="85" w:type="dxa"/>
-              <w:end w:w="85" w:type="dxa"/>
+              <w:top w:w="55" w:type="dxa"/>
+              <w:bottom w:w="55" w:type="dxa"/>
+              <w:start w:w="40" w:type="dxa"/>
+              <w:end w:w="40" w:type="dxa"/>
             </w:tcMar>
             <w:shd w:fill="FFFFFF" w:val="clear"/>
           </w:tcPr>
@@ -6930,7 +7192,7 @@
               <w:rPr>
                 <w:rFonts w:ascii="Liberation Sans" w:hAnsi="Liberation Sans" w:eastAsia="Liberation Sans" w:cs="Liberation Sans"/>
                 <w:color w:val="232A30"/>
-                <w:sz w:val="18"/>
+                <w:sz w:val="16"/>
               </w:rPr>
               <w:t xml:space="preserve">Late report-path cut</w:t>
             </w:r>
@@ -6938,13 +7200,13 @@
         </w:tc>
         <w:tc>
           <w:tcPr>
-            <w:tcW w:w="1499" w:type="dxa"/>
+            <w:tcW w:w="1599" w:type="dxa"/>
             <w:vAlign w:val="center"/>
             <w:tcMar>
-              <w:top w:w="70" w:type="dxa"/>
-              <w:bottom w:w="70" w:type="dxa"/>
-              <w:start w:w="85" w:type="dxa"/>
-              <w:end w:w="85" w:type="dxa"/>
+              <w:top w:w="55" w:type="dxa"/>
+              <w:bottom w:w="55" w:type="dxa"/>
+              <w:start w:w="40" w:type="dxa"/>
+              <w:end w:w="40" w:type="dxa"/>
             </w:tcMar>
             <w:shd w:fill="FFFFFF" w:val="clear"/>
           </w:tcPr>
@@ -6954,79 +7216,25 @@
               <w:spacing w:before="0" w:after="40" w:line="240" w:lineRule="auto"/>
               <w:jc w:val="center"/>
             </w:pPr>
-            <m:oMath>
-              <m:r>
-                <m:rPr>
-                  <m:sty m:val="p"/>
-                </m:rPr>
-                <w:rPr>
-                  <w:sz w:val="18"/>
-                  <w:szCs w:val="18"/>
-                  <w:color w:val="232A30"/>
-                </w:rPr>
-                <m:t>[</m:t>
-              </m:r>
-              <m:r>
-                <m:rPr>
-                  <m:sty m:val="p"/>
-                </m:rPr>
-                <w:rPr>
-                  <w:sz w:val="18"/>
-                  <w:szCs w:val="18"/>
-                  <w:color w:val="232A30"/>
-                </w:rPr>
-                <m:t>−</m:t>
-              </m:r>
-              <m:r>
-                <w:rPr>
-                  <w:sz w:val="18"/>
-                  <w:szCs w:val="18"/>
-                  <w:color w:val="232A30"/>
-                </w:rPr>
-                <m:t>.03</m:t>
-              </m:r>
-              <m:r>
-                <m:rPr>
-                  <m:sty m:val="p"/>
-                </m:rPr>
-                <w:rPr>
-                  <w:sz w:val="18"/>
-                  <w:szCs w:val="18"/>
-                  <w:color w:val="232A30"/>
-                </w:rPr>
-                <m:t>,</m:t>
-              </m:r>
-              <m:r>
-                <w:rPr>
-                  <w:sz w:val="18"/>
-                  <w:szCs w:val="18"/>
-                  <w:color w:val="232A30"/>
-                </w:rPr>
-                <m:t>.03</m:t>
-              </m:r>
-              <m:r>
-                <m:rPr>
-                  <m:sty m:val="p"/>
-                </m:rPr>
-                <w:rPr>
-                  <w:sz w:val="18"/>
-                  <w:szCs w:val="18"/>
-                  <w:color w:val="232A30"/>
-                </w:rPr>
-                <m:t>]</m:t>
-              </m:r>
-            </m:oMath>
+            <w:r>
+              <w:rPr>
+                <w:rFonts w:ascii="Liberation Sans" w:hAnsi="Liberation Sans" w:eastAsia="Liberation Sans" w:cs="Liberation Sans"/>
+                <w:color w:val="232A30"/>
+                <w:sz w:val="16"/>
+              </w:rPr>
+              <w:t>[−.03,.03]</w:t>
+            </w:r>
           </w:p>
         </w:tc>
         <w:tc>
           <w:tcPr>
-            <w:tcW w:w="1499" w:type="dxa"/>
+            <w:tcW w:w="1599" w:type="dxa"/>
             <w:vAlign w:val="center"/>
             <w:tcMar>
-              <w:top w:w="70" w:type="dxa"/>
-              <w:bottom w:w="70" w:type="dxa"/>
-              <w:start w:w="85" w:type="dxa"/>
-              <w:end w:w="85" w:type="dxa"/>
+              <w:top w:w="55" w:type="dxa"/>
+              <w:bottom w:w="55" w:type="dxa"/>
+              <w:start w:w="40" w:type="dxa"/>
+              <w:end w:w="40" w:type="dxa"/>
             </w:tcMar>
             <w:shd w:fill="FFFFFF" w:val="clear"/>
           </w:tcPr>
@@ -7036,79 +7244,25 @@
               <w:spacing w:before="0" w:after="40" w:line="240" w:lineRule="auto"/>
               <w:jc w:val="center"/>
             </w:pPr>
-            <m:oMath>
-              <m:r>
-                <m:rPr>
-                  <m:sty m:val="p"/>
-                </m:rPr>
-                <w:rPr>
-                  <w:sz w:val="18"/>
-                  <w:szCs w:val="18"/>
-                  <w:color w:val="232A30"/>
-                </w:rPr>
-                <m:t>[</m:t>
-              </m:r>
-              <m:r>
-                <m:rPr>
-                  <m:sty m:val="p"/>
-                </m:rPr>
-                <w:rPr>
-                  <w:sz w:val="18"/>
-                  <w:szCs w:val="18"/>
-                  <w:color w:val="232A30"/>
-                </w:rPr>
-                <m:t>−</m:t>
-              </m:r>
-              <m:r>
-                <w:rPr>
-                  <w:sz w:val="18"/>
-                  <w:szCs w:val="18"/>
-                  <w:color w:val="232A30"/>
-                </w:rPr>
-                <m:t>.05</m:t>
-              </m:r>
-              <m:r>
-                <m:rPr>
-                  <m:sty m:val="p"/>
-                </m:rPr>
-                <w:rPr>
-                  <w:sz w:val="18"/>
-                  <w:szCs w:val="18"/>
-                  <w:color w:val="232A30"/>
-                </w:rPr>
-                <m:t>,</m:t>
-              </m:r>
-              <m:r>
-                <w:rPr>
-                  <w:sz w:val="18"/>
-                  <w:szCs w:val="18"/>
-                  <w:color w:val="232A30"/>
-                </w:rPr>
-                <m:t>.03</m:t>
-              </m:r>
-              <m:r>
-                <m:rPr>
-                  <m:sty m:val="p"/>
-                </m:rPr>
-                <w:rPr>
-                  <w:sz w:val="18"/>
-                  <w:szCs w:val="18"/>
-                  <w:color w:val="232A30"/>
-                </w:rPr>
-                <m:t>]</m:t>
-              </m:r>
-            </m:oMath>
+            <w:r>
+              <w:rPr>
+                <w:rFonts w:ascii="Liberation Sans" w:hAnsi="Liberation Sans" w:eastAsia="Liberation Sans" w:cs="Liberation Sans"/>
+                <w:color w:val="232A30"/>
+                <w:sz w:val="16"/>
+              </w:rPr>
+              <w:t>[−.05,.03]</w:t>
+            </w:r>
           </w:p>
         </w:tc>
         <w:tc>
           <w:tcPr>
-            <w:tcW w:w="1499" w:type="dxa"/>
+            <w:tcW w:w="1599" w:type="dxa"/>
             <w:vAlign w:val="center"/>
             <w:tcMar>
-              <w:top w:w="70" w:type="dxa"/>
-              <w:bottom w:w="70" w:type="dxa"/>
-              <w:start w:w="85" w:type="dxa"/>
-              <w:end w:w="85" w:type="dxa"/>
+              <w:top w:w="55" w:type="dxa"/>
+              <w:bottom w:w="55" w:type="dxa"/>
+              <w:start w:w="40" w:type="dxa"/>
+              <w:end w:w="40" w:type="dxa"/>
             </w:tcMar>
             <w:shd w:fill="FFFFFF" w:val="clear"/>
           </w:tcPr>
@@ -7118,79 +7272,25 @@
               <w:spacing w:before="0" w:after="40" w:line="240" w:lineRule="auto"/>
               <w:jc w:val="center"/>
             </w:pPr>
-            <m:oMath>
-              <m:r>
-                <m:rPr>
-                  <m:sty m:val="p"/>
-                </m:rPr>
-                <w:rPr>
-                  <w:sz w:val="18"/>
-                  <w:szCs w:val="18"/>
-                  <w:color w:val="232A30"/>
-                </w:rPr>
-                <m:t>[</m:t>
-              </m:r>
-              <m:r>
-                <m:rPr>
-                  <m:sty m:val="p"/>
-                </m:rPr>
-                <w:rPr>
-                  <w:sz w:val="18"/>
-                  <w:szCs w:val="18"/>
-                  <w:color w:val="232A30"/>
-                </w:rPr>
-                <m:t>−</m:t>
-              </m:r>
-              <m:r>
-                <w:rPr>
-                  <w:sz w:val="18"/>
-                  <w:szCs w:val="18"/>
-                  <w:color w:val="232A30"/>
-                </w:rPr>
-                <m:t>.05</m:t>
-              </m:r>
-              <m:r>
-                <m:rPr>
-                  <m:sty m:val="p"/>
-                </m:rPr>
-                <w:rPr>
-                  <w:sz w:val="18"/>
-                  <w:szCs w:val="18"/>
-                  <w:color w:val="232A30"/>
-                </w:rPr>
-                <m:t>,</m:t>
-              </m:r>
-              <m:r>
-                <w:rPr>
-                  <w:sz w:val="18"/>
-                  <w:szCs w:val="18"/>
-                  <w:color w:val="232A30"/>
-                </w:rPr>
-                <m:t>.03</m:t>
-              </m:r>
-              <m:r>
-                <m:rPr>
-                  <m:sty m:val="p"/>
-                </m:rPr>
-                <w:rPr>
-                  <w:sz w:val="18"/>
-                  <w:szCs w:val="18"/>
-                  <w:color w:val="232A30"/>
-                </w:rPr>
-                <m:t>]</m:t>
-              </m:r>
-            </m:oMath>
+            <w:r>
+              <w:rPr>
+                <w:rFonts w:ascii="Liberation Sans" w:hAnsi="Liberation Sans" w:eastAsia="Liberation Sans" w:cs="Liberation Sans"/>
+                <w:color w:val="232A30"/>
+                <w:sz w:val="16"/>
+              </w:rPr>
+              <w:t>[−.05,.03]</w:t>
+            </w:r>
           </w:p>
         </w:tc>
         <w:tc>
           <w:tcPr>
-            <w:tcW w:w="3098" w:type="dxa"/>
+            <w:tcW w:w="1599" w:type="dxa"/>
             <w:vAlign w:val="center"/>
             <w:tcMar>
-              <w:top w:w="70" w:type="dxa"/>
-              <w:bottom w:w="70" w:type="dxa"/>
-              <w:start w:w="85" w:type="dxa"/>
-              <w:end w:w="85" w:type="dxa"/>
+              <w:top w:w="55" w:type="dxa"/>
+              <w:bottom w:w="55" w:type="dxa"/>
+              <w:start w:w="40" w:type="dxa"/>
+              <w:end w:w="40" w:type="dxa"/>
             </w:tcMar>
             <w:shd w:fill="FFFFFF" w:val="clear"/>
           </w:tcPr>
@@ -7200,21 +7300,47 @@
               <w:spacing w:before="0" w:after="40" w:line="240" w:lineRule="auto"/>
               <w:jc w:val="center"/>
             </w:pPr>
-            <m:oMath>
-              <m:r>
-                <w:rPr>
-                  <w:sz w:val="18"/>
-                  <w:szCs w:val="18"/>
-                  <w:color w:val="232A30"/>
-                </w:rPr>
-                <m:t>.91</m:t>
-              </m:r>
-            </m:oMath>
             <w:r>
               <w:rPr>
                 <w:rFonts w:ascii="Liberation Sans" w:hAnsi="Liberation Sans" w:eastAsia="Liberation Sans" w:cs="Liberation Sans"/>
                 <w:color w:val="232A30"/>
-                <w:sz w:val="18"/>
+                <w:sz w:val="16"/>
+              </w:rPr>
+              <w:t>[−.06,.02]</w:t>
+            </w:r>
+          </w:p>
+        </w:tc>
+        <w:tc>
+          <w:tcPr>
+            <w:tcW w:w="1799" w:type="dxa"/>
+            <w:vAlign w:val="center"/>
+            <w:tcMar>
+              <w:top w:w="55" w:type="dxa"/>
+              <w:bottom w:w="55" w:type="dxa"/>
+              <w:start w:w="40" w:type="dxa"/>
+              <w:end w:w="40" w:type="dxa"/>
+            </w:tcMar>
+            <w:shd w:fill="FFFFFF" w:val="clear"/>
+          </w:tcPr>
+          <w:p>
+            <w:pPr>
+              <w:pStyle w:val="Compact"/>
+              <w:spacing w:before="0" w:after="40" w:line="240" w:lineRule="auto"/>
+              <w:jc w:val="center"/>
+            </w:pPr>
+            <w:r>
+              <w:rPr>
+                <w:rFonts w:ascii="Liberation Sans" w:hAnsi="Liberation Sans" w:eastAsia="Liberation Sans" w:cs="Liberation Sans"/>
+                <w:color w:val="232A30"/>
+                <w:sz w:val="16"/>
+              </w:rPr>
+              <w:t>.91</w:t>
+            </w:r>
+            <w:r>
+              <w:rPr>
+                <w:rFonts w:ascii="Liberation Sans" w:hAnsi="Liberation Sans" w:eastAsia="Liberation Sans" w:cs="Liberation Sans"/>
+                <w:color w:val="232A30"/>
+                <w:sz w:val="16"/>
               </w:rPr>
               <w:t xml:space="preserve"> </w:t>
             </w:r>
@@ -7222,7 +7348,7 @@
               <w:rPr>
                 <w:rFonts w:ascii="Liberation Sans" w:hAnsi="Liberation Sans" w:eastAsia="Liberation Sans" w:cs="Liberation Sans"/>
                 <w:color w:val="232A30"/>
-                <w:sz w:val="18"/>
+                <w:sz w:val="16"/>
               </w:rPr>
               <w:t xml:space="preserve">/ pass</w:t>
             </w:r>
@@ -7235,13 +7361,13 @@
         </w:trPr>
         <w:tc>
           <w:tcPr>
-            <w:tcW w:w="2399" w:type="dxa"/>
+            <w:tcW w:w="1799" w:type="dxa"/>
             <w:vAlign w:val="center"/>
             <w:tcMar>
-              <w:top w:w="70" w:type="dxa"/>
-              <w:bottom w:w="70" w:type="dxa"/>
-              <w:start w:w="85" w:type="dxa"/>
-              <w:end w:w="85" w:type="dxa"/>
+              <w:top w:w="55" w:type="dxa"/>
+              <w:bottom w:w="55" w:type="dxa"/>
+              <w:start w:w="40" w:type="dxa"/>
+              <w:end w:w="40" w:type="dxa"/>
             </w:tcMar>
             <w:shd w:fill="F4F6F7" w:val="clear"/>
           </w:tcPr>
@@ -7254,7 +7380,7 @@
               <w:rPr>
                 <w:rFonts w:ascii="Liberation Sans" w:hAnsi="Liberation Sans" w:eastAsia="Liberation Sans" w:cs="Liberation Sans"/>
                 <w:color w:val="232A30"/>
-                <w:sz w:val="18"/>
+                <w:sz w:val="16"/>
               </w:rPr>
               <w:t xml:space="preserve">Sham</w:t>
             </w:r>
@@ -7262,13 +7388,13 @@
         </w:tc>
         <w:tc>
           <w:tcPr>
-            <w:tcW w:w="1499" w:type="dxa"/>
+            <w:tcW w:w="1599" w:type="dxa"/>
             <w:vAlign w:val="center"/>
             <w:tcMar>
-              <w:top w:w="70" w:type="dxa"/>
-              <w:bottom w:w="70" w:type="dxa"/>
-              <w:start w:w="85" w:type="dxa"/>
-              <w:end w:w="85" w:type="dxa"/>
+              <w:top w:w="55" w:type="dxa"/>
+              <w:bottom w:w="55" w:type="dxa"/>
+              <w:start w:w="40" w:type="dxa"/>
+              <w:end w:w="40" w:type="dxa"/>
             </w:tcMar>
             <w:shd w:fill="F4F6F7" w:val="clear"/>
           </w:tcPr>
@@ -7278,79 +7404,25 @@
               <w:spacing w:before="0" w:after="40" w:line="240" w:lineRule="auto"/>
               <w:jc w:val="center"/>
             </w:pPr>
-            <m:oMath>
-              <m:r>
-                <m:rPr>
-                  <m:sty m:val="p"/>
-                </m:rPr>
-                <w:rPr>
-                  <w:sz w:val="18"/>
-                  <w:szCs w:val="18"/>
-                  <w:color w:val="232A30"/>
-                </w:rPr>
-                <m:t>[</m:t>
-              </m:r>
-              <m:r>
-                <m:rPr>
-                  <m:sty m:val="p"/>
-                </m:rPr>
-                <w:rPr>
-                  <w:sz w:val="18"/>
-                  <w:szCs w:val="18"/>
-                  <w:color w:val="232A30"/>
-                </w:rPr>
-                <m:t>−</m:t>
-              </m:r>
-              <m:r>
-                <w:rPr>
-                  <w:sz w:val="18"/>
-                  <w:szCs w:val="18"/>
-                  <w:color w:val="232A30"/>
-                </w:rPr>
-                <m:t>.03</m:t>
-              </m:r>
-              <m:r>
-                <m:rPr>
-                  <m:sty m:val="p"/>
-                </m:rPr>
-                <w:rPr>
-                  <w:sz w:val="18"/>
-                  <w:szCs w:val="18"/>
-                  <w:color w:val="232A30"/>
-                </w:rPr>
-                <m:t>,</m:t>
-              </m:r>
-              <m:r>
-                <w:rPr>
-                  <w:sz w:val="18"/>
-                  <w:szCs w:val="18"/>
-                  <w:color w:val="232A30"/>
-                </w:rPr>
-                <m:t>.03</m:t>
-              </m:r>
-              <m:r>
-                <m:rPr>
-                  <m:sty m:val="p"/>
-                </m:rPr>
-                <w:rPr>
-                  <w:sz w:val="18"/>
-                  <w:szCs w:val="18"/>
-                  <w:color w:val="232A30"/>
-                </w:rPr>
-                <m:t>]</m:t>
-              </m:r>
-            </m:oMath>
+            <w:r>
+              <w:rPr>
+                <w:rFonts w:ascii="Liberation Sans" w:hAnsi="Liberation Sans" w:eastAsia="Liberation Sans" w:cs="Liberation Sans"/>
+                <w:color w:val="232A30"/>
+                <w:sz w:val="16"/>
+              </w:rPr>
+              <w:t>[−.03,.03]</w:t>
+            </w:r>
           </w:p>
         </w:tc>
         <w:tc>
           <w:tcPr>
-            <w:tcW w:w="1499" w:type="dxa"/>
+            <w:tcW w:w="1599" w:type="dxa"/>
             <w:vAlign w:val="center"/>
             <w:tcMar>
-              <w:top w:w="70" w:type="dxa"/>
-              <w:bottom w:w="70" w:type="dxa"/>
-              <w:start w:w="85" w:type="dxa"/>
-              <w:end w:w="85" w:type="dxa"/>
+              <w:top w:w="55" w:type="dxa"/>
+              <w:bottom w:w="55" w:type="dxa"/>
+              <w:start w:w="40" w:type="dxa"/>
+              <w:end w:w="40" w:type="dxa"/>
             </w:tcMar>
             <w:shd w:fill="F4F6F7" w:val="clear"/>
           </w:tcPr>
@@ -7360,79 +7432,25 @@
               <w:spacing w:before="0" w:after="40" w:line="240" w:lineRule="auto"/>
               <w:jc w:val="center"/>
             </w:pPr>
-            <m:oMath>
-              <m:r>
-                <m:rPr>
-                  <m:sty m:val="p"/>
-                </m:rPr>
-                <w:rPr>
-                  <w:sz w:val="18"/>
-                  <w:szCs w:val="18"/>
-                  <w:color w:val="232A30"/>
-                </w:rPr>
-                <m:t>[</m:t>
-              </m:r>
-              <m:r>
-                <m:rPr>
-                  <m:sty m:val="p"/>
-                </m:rPr>
-                <w:rPr>
-                  <w:sz w:val="18"/>
-                  <w:szCs w:val="18"/>
-                  <w:color w:val="232A30"/>
-                </w:rPr>
-                <m:t>−</m:t>
-              </m:r>
-              <m:r>
-                <w:rPr>
-                  <w:sz w:val="18"/>
-                  <w:szCs w:val="18"/>
-                  <w:color w:val="232A30"/>
-                </w:rPr>
-                <m:t>.05</m:t>
-              </m:r>
-              <m:r>
-                <m:rPr>
-                  <m:sty m:val="p"/>
-                </m:rPr>
-                <w:rPr>
-                  <w:sz w:val="18"/>
-                  <w:szCs w:val="18"/>
-                  <w:color w:val="232A30"/>
-                </w:rPr>
-                <m:t>,</m:t>
-              </m:r>
-              <m:r>
-                <w:rPr>
-                  <w:sz w:val="18"/>
-                  <w:szCs w:val="18"/>
-                  <w:color w:val="232A30"/>
-                </w:rPr>
-                <m:t>.03</m:t>
-              </m:r>
-              <m:r>
-                <m:rPr>
-                  <m:sty m:val="p"/>
-                </m:rPr>
-                <w:rPr>
-                  <w:sz w:val="18"/>
-                  <w:szCs w:val="18"/>
-                  <w:color w:val="232A30"/>
-                </w:rPr>
-                <m:t>]</m:t>
-              </m:r>
-            </m:oMath>
+            <w:r>
+              <w:rPr>
+                <w:rFonts w:ascii="Liberation Sans" w:hAnsi="Liberation Sans" w:eastAsia="Liberation Sans" w:cs="Liberation Sans"/>
+                <w:color w:val="232A30"/>
+                <w:sz w:val="16"/>
+              </w:rPr>
+              <w:t>[−.05,.03]</w:t>
+            </w:r>
           </w:p>
         </w:tc>
         <w:tc>
           <w:tcPr>
-            <w:tcW w:w="1499" w:type="dxa"/>
+            <w:tcW w:w="1599" w:type="dxa"/>
             <w:vAlign w:val="center"/>
             <w:tcMar>
-              <w:top w:w="70" w:type="dxa"/>
-              <w:bottom w:w="70" w:type="dxa"/>
-              <w:start w:w="85" w:type="dxa"/>
-              <w:end w:w="85" w:type="dxa"/>
+              <w:top w:w="55" w:type="dxa"/>
+              <w:bottom w:w="55" w:type="dxa"/>
+              <w:start w:w="40" w:type="dxa"/>
+              <w:end w:w="40" w:type="dxa"/>
             </w:tcMar>
             <w:shd w:fill="F4F6F7" w:val="clear"/>
           </w:tcPr>
@@ -7442,79 +7460,25 @@
               <w:spacing w:before="0" w:after="40" w:line="240" w:lineRule="auto"/>
               <w:jc w:val="center"/>
             </w:pPr>
-            <m:oMath>
-              <m:r>
-                <m:rPr>
-                  <m:sty m:val="p"/>
-                </m:rPr>
-                <w:rPr>
-                  <w:sz w:val="18"/>
-                  <w:szCs w:val="18"/>
-                  <w:color w:val="232A30"/>
-                </w:rPr>
-                <m:t>[</m:t>
-              </m:r>
-              <m:r>
-                <m:rPr>
-                  <m:sty m:val="p"/>
-                </m:rPr>
-                <w:rPr>
-                  <w:sz w:val="18"/>
-                  <w:szCs w:val="18"/>
-                  <w:color w:val="232A30"/>
-                </w:rPr>
-                <m:t>−</m:t>
-              </m:r>
-              <m:r>
-                <w:rPr>
-                  <w:sz w:val="18"/>
-                  <w:szCs w:val="18"/>
-                  <w:color w:val="232A30"/>
-                </w:rPr>
-                <m:t>.05</m:t>
-              </m:r>
-              <m:r>
-                <m:rPr>
-                  <m:sty m:val="p"/>
-                </m:rPr>
-                <w:rPr>
-                  <w:sz w:val="18"/>
-                  <w:szCs w:val="18"/>
-                  <w:color w:val="232A30"/>
-                </w:rPr>
-                <m:t>,</m:t>
-              </m:r>
-              <m:r>
-                <w:rPr>
-                  <w:sz w:val="18"/>
-                  <w:szCs w:val="18"/>
-                  <w:color w:val="232A30"/>
-                </w:rPr>
-                <m:t>.03</m:t>
-              </m:r>
-              <m:r>
-                <m:rPr>
-                  <m:sty m:val="p"/>
-                </m:rPr>
-                <w:rPr>
-                  <w:sz w:val="18"/>
-                  <w:szCs w:val="18"/>
-                  <w:color w:val="232A30"/>
-                </w:rPr>
-                <m:t>]</m:t>
-              </m:r>
-            </m:oMath>
+            <w:r>
+              <w:rPr>
+                <w:rFonts w:ascii="Liberation Sans" w:hAnsi="Liberation Sans" w:eastAsia="Liberation Sans" w:cs="Liberation Sans"/>
+                <w:color w:val="232A30"/>
+                <w:sz w:val="16"/>
+              </w:rPr>
+              <w:t>[−.05,.03]</w:t>
+            </w:r>
           </w:p>
         </w:tc>
         <w:tc>
           <w:tcPr>
-            <w:tcW w:w="3098" w:type="dxa"/>
+            <w:tcW w:w="1599" w:type="dxa"/>
             <w:vAlign w:val="center"/>
             <w:tcMar>
-              <w:top w:w="70" w:type="dxa"/>
-              <w:bottom w:w="70" w:type="dxa"/>
-              <w:start w:w="85" w:type="dxa"/>
-              <w:end w:w="85" w:type="dxa"/>
+              <w:top w:w="55" w:type="dxa"/>
+              <w:bottom w:w="55" w:type="dxa"/>
+              <w:start w:w="40" w:type="dxa"/>
+              <w:end w:w="40" w:type="dxa"/>
             </w:tcMar>
             <w:shd w:fill="F4F6F7" w:val="clear"/>
           </w:tcPr>
@@ -7524,21 +7488,47 @@
               <w:spacing w:before="0" w:after="40" w:line="240" w:lineRule="auto"/>
               <w:jc w:val="center"/>
             </w:pPr>
-            <m:oMath>
-              <m:r>
-                <w:rPr>
-                  <w:sz w:val="18"/>
-                  <w:szCs w:val="18"/>
-                  <w:color w:val="232A30"/>
-                </w:rPr>
-                <m:t>.91</m:t>
-              </m:r>
-            </m:oMath>
             <w:r>
               <w:rPr>
                 <w:rFonts w:ascii="Liberation Sans" w:hAnsi="Liberation Sans" w:eastAsia="Liberation Sans" w:cs="Liberation Sans"/>
                 <w:color w:val="232A30"/>
-                <w:sz w:val="18"/>
+                <w:sz w:val="16"/>
+              </w:rPr>
+              <w:t>[−.05,.03]</w:t>
+            </w:r>
+          </w:p>
+        </w:tc>
+        <w:tc>
+          <w:tcPr>
+            <w:tcW w:w="1799" w:type="dxa"/>
+            <w:vAlign w:val="center"/>
+            <w:tcMar>
+              <w:top w:w="55" w:type="dxa"/>
+              <w:bottom w:w="55" w:type="dxa"/>
+              <w:start w:w="40" w:type="dxa"/>
+              <w:end w:w="40" w:type="dxa"/>
+            </w:tcMar>
+            <w:shd w:fill="F4F6F7" w:val="clear"/>
+          </w:tcPr>
+          <w:p>
+            <w:pPr>
+              <w:pStyle w:val="Compact"/>
+              <w:spacing w:before="0" w:after="40" w:line="240" w:lineRule="auto"/>
+              <w:jc w:val="center"/>
+            </w:pPr>
+            <w:r>
+              <w:rPr>
+                <w:rFonts w:ascii="Liberation Sans" w:hAnsi="Liberation Sans" w:eastAsia="Liberation Sans" w:cs="Liberation Sans"/>
+                <w:color w:val="232A30"/>
+                <w:sz w:val="16"/>
+              </w:rPr>
+              <w:t>.91</w:t>
+            </w:r>
+            <w:r>
+              <w:rPr>
+                <w:rFonts w:ascii="Liberation Sans" w:hAnsi="Liberation Sans" w:eastAsia="Liberation Sans" w:cs="Liberation Sans"/>
+                <w:color w:val="232A30"/>
+                <w:sz w:val="16"/>
               </w:rPr>
               <w:t xml:space="preserve"> </w:t>
             </w:r>
@@ -7546,7 +7536,7 @@
               <w:rPr>
                 <w:rFonts w:ascii="Liberation Sans" w:hAnsi="Liberation Sans" w:eastAsia="Liberation Sans" w:cs="Liberation Sans"/>
                 <w:color w:val="232A30"/>
-                <w:sz w:val="18"/>
+                <w:sz w:val="16"/>
               </w:rPr>
               <w:t xml:space="preserve">/ pass</w:t>
             </w:r>
@@ -7559,13 +7549,13 @@
         </w:trPr>
         <w:tc>
           <w:tcPr>
-            <w:tcW w:w="2399" w:type="dxa"/>
+            <w:tcW w:w="1799" w:type="dxa"/>
             <w:vAlign w:val="center"/>
             <w:tcMar>
-              <w:top w:w="70" w:type="dxa"/>
-              <w:bottom w:w="70" w:type="dxa"/>
-              <w:start w:w="85" w:type="dxa"/>
-              <w:end w:w="85" w:type="dxa"/>
+              <w:top w:w="55" w:type="dxa"/>
+              <w:bottom w:w="55" w:type="dxa"/>
+              <w:start w:w="40" w:type="dxa"/>
+              <w:end w:w="40" w:type="dxa"/>
             </w:tcMar>
             <w:shd w:fill="FFFFFF" w:val="clear"/>
           </w:tcPr>
@@ -7578,7 +7568,7 @@
               <w:rPr>
                 <w:rFonts w:ascii="Liberation Sans" w:hAnsi="Liberation Sans" w:eastAsia="Liberation Sans" w:cs="Liberation Sans"/>
                 <w:color w:val="232A30"/>
-                <w:sz w:val="18"/>
+                <w:sz w:val="16"/>
               </w:rPr>
               <w:t xml:space="preserve">Pathway rescue after target cut</w:t>
             </w:r>
@@ -7586,13 +7576,13 @@
         </w:tc>
         <w:tc>
           <w:tcPr>
-            <w:tcW w:w="1499" w:type="dxa"/>
+            <w:tcW w:w="1599" w:type="dxa"/>
             <w:vAlign w:val="center"/>
             <w:tcMar>
-              <w:top w:w="70" w:type="dxa"/>
-              <w:bottom w:w="70" w:type="dxa"/>
-              <w:start w:w="85" w:type="dxa"/>
-              <w:end w:w="85" w:type="dxa"/>
+              <w:top w:w="55" w:type="dxa"/>
+              <w:bottom w:w="55" w:type="dxa"/>
+              <w:start w:w="40" w:type="dxa"/>
+              <w:end w:w="40" w:type="dxa"/>
             </w:tcMar>
             <w:shd w:fill="FFFFFF" w:val="clear"/>
           </w:tcPr>
@@ -7602,79 +7592,25 @@
               <w:spacing w:before="0" w:after="40" w:line="240" w:lineRule="auto"/>
               <w:jc w:val="center"/>
             </w:pPr>
-            <m:oMath>
-              <m:r>
-                <m:rPr>
-                  <m:sty m:val="p"/>
-                </m:rPr>
-                <w:rPr>
-                  <w:sz w:val="18"/>
-                  <w:szCs w:val="18"/>
-                  <w:color w:val="232A30"/>
-                </w:rPr>
-                <m:t>[</m:t>
-              </m:r>
-              <m:r>
-                <m:rPr>
-                  <m:sty m:val="p"/>
-                </m:rPr>
-                <w:rPr>
-                  <w:sz w:val="18"/>
-                  <w:szCs w:val="18"/>
-                  <w:color w:val="232A30"/>
-                </w:rPr>
-                <m:t>−</m:t>
-              </m:r>
-              <m:r>
-                <w:rPr>
-                  <w:sz w:val="18"/>
-                  <w:szCs w:val="18"/>
-                  <w:color w:val="232A30"/>
-                </w:rPr>
-                <m:t>.04</m:t>
-              </m:r>
-              <m:r>
-                <m:rPr>
-                  <m:sty m:val="p"/>
-                </m:rPr>
-                <w:rPr>
-                  <w:sz w:val="18"/>
-                  <w:szCs w:val="18"/>
-                  <w:color w:val="232A30"/>
-                </w:rPr>
-                <m:t>,</m:t>
-              </m:r>
-              <m:r>
-                <w:rPr>
-                  <w:sz w:val="18"/>
-                  <w:szCs w:val="18"/>
-                  <w:color w:val="232A30"/>
-                </w:rPr>
-                <m:t>.02</m:t>
-              </m:r>
-              <m:r>
-                <m:rPr>
-                  <m:sty m:val="p"/>
-                </m:rPr>
-                <w:rPr>
-                  <w:sz w:val="18"/>
-                  <w:szCs w:val="18"/>
-                  <w:color w:val="232A30"/>
-                </w:rPr>
-                <m:t>]</m:t>
-              </m:r>
-            </m:oMath>
+            <w:r>
+              <w:rPr>
+                <w:rFonts w:ascii="Liberation Sans" w:hAnsi="Liberation Sans" w:eastAsia="Liberation Sans" w:cs="Liberation Sans"/>
+                <w:color w:val="232A30"/>
+                <w:sz w:val="16"/>
+              </w:rPr>
+              <w:t>[−.04,.02]</w:t>
+            </w:r>
           </w:p>
         </w:tc>
         <w:tc>
           <w:tcPr>
-            <w:tcW w:w="1499" w:type="dxa"/>
+            <w:tcW w:w="1599" w:type="dxa"/>
             <w:vAlign w:val="center"/>
             <w:tcMar>
-              <w:top w:w="70" w:type="dxa"/>
-              <w:bottom w:w="70" w:type="dxa"/>
-              <w:start w:w="85" w:type="dxa"/>
-              <w:end w:w="85" w:type="dxa"/>
+              <w:top w:w="55" w:type="dxa"/>
+              <w:bottom w:w="55" w:type="dxa"/>
+              <w:start w:w="40" w:type="dxa"/>
+              <w:end w:w="40" w:type="dxa"/>
             </w:tcMar>
             <w:shd w:fill="FFFFFF" w:val="clear"/>
           </w:tcPr>
@@ -7684,79 +7620,25 @@
               <w:spacing w:before="0" w:after="40" w:line="240" w:lineRule="auto"/>
               <w:jc w:val="center"/>
             </w:pPr>
-            <m:oMath>
-              <m:r>
-                <m:rPr>
-                  <m:sty m:val="p"/>
-                </m:rPr>
-                <w:rPr>
-                  <w:sz w:val="18"/>
-                  <w:szCs w:val="18"/>
-                  <w:color w:val="232A30"/>
-                </w:rPr>
-                <m:t>[</m:t>
-              </m:r>
-              <m:r>
-                <m:rPr>
-                  <m:sty m:val="p"/>
-                </m:rPr>
-                <w:rPr>
-                  <w:sz w:val="18"/>
-                  <w:szCs w:val="18"/>
-                  <w:color w:val="232A30"/>
-                </w:rPr>
-                <m:t>−</m:t>
-              </m:r>
-              <m:r>
-                <w:rPr>
-                  <w:sz w:val="18"/>
-                  <w:szCs w:val="18"/>
-                  <w:color w:val="232A30"/>
-                </w:rPr>
-                <m:t>.06</m:t>
-              </m:r>
-              <m:r>
-                <m:rPr>
-                  <m:sty m:val="p"/>
-                </m:rPr>
-                <w:rPr>
-                  <w:sz w:val="18"/>
-                  <w:szCs w:val="18"/>
-                  <w:color w:val="232A30"/>
-                </w:rPr>
-                <m:t>,</m:t>
-              </m:r>
-              <m:r>
-                <w:rPr>
-                  <w:sz w:val="18"/>
-                  <w:szCs w:val="18"/>
-                  <w:color w:val="232A30"/>
-                </w:rPr>
-                <m:t>.02</m:t>
-              </m:r>
-              <m:r>
-                <m:rPr>
-                  <m:sty m:val="p"/>
-                </m:rPr>
-                <w:rPr>
-                  <w:sz w:val="18"/>
-                  <w:szCs w:val="18"/>
-                  <w:color w:val="232A30"/>
-                </w:rPr>
-                <m:t>]</m:t>
-              </m:r>
-            </m:oMath>
+            <w:r>
+              <w:rPr>
+                <w:rFonts w:ascii="Liberation Sans" w:hAnsi="Liberation Sans" w:eastAsia="Liberation Sans" w:cs="Liberation Sans"/>
+                <w:color w:val="232A30"/>
+                <w:sz w:val="16"/>
+              </w:rPr>
+              <w:t>[−.06,.02]</w:t>
+            </w:r>
           </w:p>
         </w:tc>
         <w:tc>
           <w:tcPr>
-            <w:tcW w:w="1499" w:type="dxa"/>
+            <w:tcW w:w="1599" w:type="dxa"/>
             <w:vAlign w:val="center"/>
             <w:tcMar>
-              <w:top w:w="70" w:type="dxa"/>
-              <w:bottom w:w="70" w:type="dxa"/>
-              <w:start w:w="85" w:type="dxa"/>
-              <w:end w:w="85" w:type="dxa"/>
+              <w:top w:w="55" w:type="dxa"/>
+              <w:bottom w:w="55" w:type="dxa"/>
+              <w:start w:w="40" w:type="dxa"/>
+              <w:end w:w="40" w:type="dxa"/>
             </w:tcMar>
             <w:shd w:fill="FFFFFF" w:val="clear"/>
           </w:tcPr>
@@ -7766,79 +7648,25 @@
               <w:spacing w:before="0" w:after="40" w:line="240" w:lineRule="auto"/>
               <w:jc w:val="center"/>
             </w:pPr>
-            <m:oMath>
-              <m:r>
-                <m:rPr>
-                  <m:sty m:val="p"/>
-                </m:rPr>
-                <w:rPr>
-                  <w:sz w:val="18"/>
-                  <w:szCs w:val="18"/>
-                  <w:color w:val="232A30"/>
-                </w:rPr>
-                <m:t>[</m:t>
-              </m:r>
-              <m:r>
-                <m:rPr>
-                  <m:sty m:val="p"/>
-                </m:rPr>
-                <w:rPr>
-                  <w:sz w:val="18"/>
-                  <w:szCs w:val="18"/>
-                  <w:color w:val="232A30"/>
-                </w:rPr>
-                <m:t>−</m:t>
-              </m:r>
-              <m:r>
-                <w:rPr>
-                  <w:sz w:val="18"/>
-                  <w:szCs w:val="18"/>
-                  <w:color w:val="232A30"/>
-                </w:rPr>
-                <m:t>.06</m:t>
-              </m:r>
-              <m:r>
-                <m:rPr>
-                  <m:sty m:val="p"/>
-                </m:rPr>
-                <w:rPr>
-                  <w:sz w:val="18"/>
-                  <w:szCs w:val="18"/>
-                  <w:color w:val="232A30"/>
-                </w:rPr>
-                <m:t>,</m:t>
-              </m:r>
-              <m:r>
-                <w:rPr>
-                  <w:sz w:val="18"/>
-                  <w:szCs w:val="18"/>
-                  <w:color w:val="232A30"/>
-                </w:rPr>
-                <m:t>.02</m:t>
-              </m:r>
-              <m:r>
-                <m:rPr>
-                  <m:sty m:val="p"/>
-                </m:rPr>
-                <w:rPr>
-                  <w:sz w:val="18"/>
-                  <w:szCs w:val="18"/>
-                  <w:color w:val="232A30"/>
-                </w:rPr>
-                <m:t>]</m:t>
-              </m:r>
-            </m:oMath>
+            <w:r>
+              <w:rPr>
+                <w:rFonts w:ascii="Liberation Sans" w:hAnsi="Liberation Sans" w:eastAsia="Liberation Sans" w:cs="Liberation Sans"/>
+                <w:color w:val="232A30"/>
+                <w:sz w:val="16"/>
+              </w:rPr>
+              <w:t>[−.06,.02]</w:t>
+            </w:r>
           </w:p>
         </w:tc>
         <w:tc>
           <w:tcPr>
-            <w:tcW w:w="3098" w:type="dxa"/>
+            <w:tcW w:w="1599" w:type="dxa"/>
             <w:vAlign w:val="center"/>
             <w:tcMar>
-              <w:top w:w="70" w:type="dxa"/>
-              <w:bottom w:w="70" w:type="dxa"/>
-              <w:start w:w="85" w:type="dxa"/>
-              <w:end w:w="85" w:type="dxa"/>
+              <w:top w:w="55" w:type="dxa"/>
+              <w:bottom w:w="55" w:type="dxa"/>
+              <w:start w:w="40" w:type="dxa"/>
+              <w:end w:w="40" w:type="dxa"/>
             </w:tcMar>
             <w:shd w:fill="FFFFFF" w:val="clear"/>
           </w:tcPr>
@@ -7848,21 +7676,47 @@
               <w:spacing w:before="0" w:after="40" w:line="240" w:lineRule="auto"/>
               <w:jc w:val="center"/>
             </w:pPr>
-            <m:oMath>
-              <m:r>
-                <w:rPr>
-                  <w:sz w:val="18"/>
-                  <w:szCs w:val="18"/>
-                  <w:color w:val="232A30"/>
-                </w:rPr>
-                <m:t>.90</m:t>
-              </m:r>
-            </m:oMath>
             <w:r>
               <w:rPr>
                 <w:rFonts w:ascii="Liberation Sans" w:hAnsi="Liberation Sans" w:eastAsia="Liberation Sans" w:cs="Liberation Sans"/>
                 <w:color w:val="232A30"/>
-                <w:sz w:val="18"/>
+                <w:sz w:val="16"/>
+              </w:rPr>
+              <w:t>[−.07,.01]</w:t>
+            </w:r>
+          </w:p>
+        </w:tc>
+        <w:tc>
+          <w:tcPr>
+            <w:tcW w:w="1799" w:type="dxa"/>
+            <w:vAlign w:val="center"/>
+            <w:tcMar>
+              <w:top w:w="55" w:type="dxa"/>
+              <w:bottom w:w="55" w:type="dxa"/>
+              <w:start w:w="40" w:type="dxa"/>
+              <w:end w:w="40" w:type="dxa"/>
+            </w:tcMar>
+            <w:shd w:fill="FFFFFF" w:val="clear"/>
+          </w:tcPr>
+          <w:p>
+            <w:pPr>
+              <w:pStyle w:val="Compact"/>
+              <w:spacing w:before="0" w:after="40" w:line="240" w:lineRule="auto"/>
+              <w:jc w:val="center"/>
+            </w:pPr>
+            <w:r>
+              <w:rPr>
+                <w:rFonts w:ascii="Liberation Sans" w:hAnsi="Liberation Sans" w:eastAsia="Liberation Sans" w:cs="Liberation Sans"/>
+                <w:color w:val="232A30"/>
+                <w:sz w:val="16"/>
+              </w:rPr>
+              <w:t>.90</w:t>
+            </w:r>
+            <w:r>
+              <w:rPr>
+                <w:rFonts w:ascii="Liberation Sans" w:hAnsi="Liberation Sans" w:eastAsia="Liberation Sans" w:cs="Liberation Sans"/>
+                <w:color w:val="232A30"/>
+                <w:sz w:val="16"/>
               </w:rPr>
               <w:t xml:space="preserve"> </w:t>
             </w:r>
@@ -7870,7 +7724,7 @@
               <w:rPr>
                 <w:rFonts w:ascii="Liberation Sans" w:hAnsi="Liberation Sans" w:eastAsia="Liberation Sans" w:cs="Liberation Sans"/>
                 <w:color w:val="232A30"/>
-                <w:sz w:val="18"/>
+                <w:sz w:val="16"/>
               </w:rPr>
               <w:t xml:space="preserve">/ pass</w:t>
             </w:r>
@@ -12287,6 +12141,17 @@
       <m:oMath>
         <m:r>
           <m:t>.05</m:t>
+        </m:r>
+      </m:oMath>
+      <w:r>
+        <w:t xml:space="preserve">; the preregistered familywise probability for the observed two-run pattern is</w:t>
+      </w:r>
+      <w:r>
+        <w:t xml:space="preserve"> </w:t>
+      </w:r>
+      <m:oMath>
+        <m:r>
+          <m:t>.032</m:t>
         </m:r>
       </m:oMath>
       <w:r>

</xml_diff>